<commit_message>
revision of must Haves
</commit_message>
<xml_diff>
--- a/Contx - must Haves 50%.docx
+++ b/Contx - must Haves 50%.docx
@@ -40,7 +40,12 @@
         <w:rPr>
           <w:rtl w:val="0"/>
         </w:rPr>
-        <w:t xml:space="preserve">A Desktop and Web Application for Enforcing Academic Integrity through System-Wide Lockdown and On-Device Automated Assessment</w:t>
+        <w:t xml:space="preserve">A Low-Level Keyboard-Hook Lockdown and On-Device Compiler-Based Assessment Engine for Secure Programming Exams</w:t>
+      </w:r>
+      <w:r>
+        <w:rPr>
+          <w:rtl w:val="0"/>
+        </w:rPr>
       </w:r>
     </w:p>
     <w:p>
@@ -244,7 +249,7 @@
       <w:pPr>
         <w:numPr>
           <w:ilvl w:val="0"/>
-          <w:numId w:val="5"/>
+          <w:numId w:val="6"/>
         </w:numPr>
         <w:spacing w:before="240" w:line="276" w:lineRule="auto"/>
         <w:ind w:left="720" w:hanging="360"/>
@@ -265,7 +270,7 @@
       <w:pPr>
         <w:numPr>
           <w:ilvl w:val="0"/>
-          <w:numId w:val="5"/>
+          <w:numId w:val="6"/>
         </w:numPr>
         <w:spacing w:line="276" w:lineRule="auto"/>
         <w:ind w:left="720" w:hanging="360"/>
@@ -286,7 +291,7 @@
       <w:pPr>
         <w:numPr>
           <w:ilvl w:val="1"/>
-          <w:numId w:val="5"/>
+          <w:numId w:val="6"/>
         </w:numPr>
         <w:spacing w:line="276" w:lineRule="auto"/>
         <w:ind w:left="1440" w:hanging="360"/>
@@ -307,7 +312,7 @@
       <w:pPr>
         <w:numPr>
           <w:ilvl w:val="1"/>
-          <w:numId w:val="5"/>
+          <w:numId w:val="6"/>
         </w:numPr>
         <w:spacing w:line="276" w:lineRule="auto"/>
         <w:ind w:left="1440" w:hanging="360"/>
@@ -328,7 +333,7 @@
       <w:pPr>
         <w:numPr>
           <w:ilvl w:val="1"/>
-          <w:numId w:val="5"/>
+          <w:numId w:val="6"/>
         </w:numPr>
         <w:spacing w:line="276" w:lineRule="auto"/>
         <w:ind w:left="1440" w:hanging="360"/>
@@ -349,7 +354,7 @@
       <w:pPr>
         <w:numPr>
           <w:ilvl w:val="1"/>
-          <w:numId w:val="5"/>
+          <w:numId w:val="6"/>
         </w:numPr>
         <w:spacing w:line="276" w:lineRule="auto"/>
         <w:ind w:left="1440" w:hanging="360"/>
@@ -370,7 +375,7 @@
       <w:pPr>
         <w:numPr>
           <w:ilvl w:val="1"/>
-          <w:numId w:val="5"/>
+          <w:numId w:val="6"/>
         </w:numPr>
         <w:spacing w:line="276" w:lineRule="auto"/>
         <w:ind w:left="1440" w:hanging="360"/>
@@ -391,7 +396,7 @@
       <w:pPr>
         <w:numPr>
           <w:ilvl w:val="0"/>
-          <w:numId w:val="5"/>
+          <w:numId w:val="6"/>
         </w:numPr>
         <w:spacing w:line="276" w:lineRule="auto"/>
         <w:ind w:left="720" w:hanging="360"/>
@@ -412,7 +417,7 @@
       <w:pPr>
         <w:numPr>
           <w:ilvl w:val="0"/>
-          <w:numId w:val="5"/>
+          <w:numId w:val="6"/>
         </w:numPr>
         <w:spacing w:line="276" w:lineRule="auto"/>
         <w:ind w:left="720" w:hanging="360"/>
@@ -433,7 +438,7 @@
       <w:pPr>
         <w:numPr>
           <w:ilvl w:val="0"/>
-          <w:numId w:val="5"/>
+          <w:numId w:val="6"/>
         </w:numPr>
         <w:spacing w:line="276" w:lineRule="auto"/>
         <w:ind w:left="720" w:hanging="360"/>
@@ -454,20 +459,167 @@
       <w:pPr>
         <w:numPr>
           <w:ilvl w:val="0"/>
+          <w:numId w:val="11"/>
+        </w:numPr>
+        <w:spacing w:line="276" w:lineRule="auto"/>
+        <w:ind w:left="720" w:hanging="360"/>
+        <w:rPr>
+          <w:highlight w:val="yellow"/>
+        </w:rPr>
+      </w:pPr>
+      <w:r>
+        <w:rPr>
+          <w:highlight w:val="yellow"/>
+          <w:rtl w:val="0"/>
+        </w:rPr>
+        <w:t xml:space="preserve">The system records and monitors student keystroke activity during the examination session for audit and behavioral review.</w:t>
+      </w:r>
+    </w:p>
+    <w:p>
+      <w:pPr>
+        <w:numPr>
+          <w:ilvl w:val="0"/>
+          <w:numId w:val="11"/>
+        </w:numPr>
+        <w:spacing w:line="276" w:lineRule="auto"/>
+        <w:ind w:left="720" w:hanging="360"/>
+        <w:rPr>
+          <w:highlight w:val="yellow"/>
+        </w:rPr>
+      </w:pPr>
+      <w:r>
+        <w:rPr>
+          <w:highlight w:val="yellow"/>
+          <w:rtl w:val="0"/>
+        </w:rPr>
+        <w:t xml:space="preserve">Keystroke logs are timestamped and associated with specific question interactions.</w:t>
+      </w:r>
+    </w:p>
+    <w:p>
+      <w:pPr>
+        <w:numPr>
+          <w:ilvl w:val="0"/>
+          <w:numId w:val="11"/>
+        </w:numPr>
+        <w:spacing w:line="276" w:lineRule="auto"/>
+        <w:ind w:left="720" w:hanging="360"/>
+        <w:rPr>
+          <w:highlight w:val="yellow"/>
+        </w:rPr>
+      </w:pPr>
+      <w:r>
+        <w:rPr>
+          <w:highlight w:val="yellow"/>
+          <w:rtl w:val="0"/>
+        </w:rPr>
+        <w:t xml:space="preserve">Keystroke monitoring applies only during an exam session inside the CodeLit application and is used for academic integrity investigation and incident reporting.</w:t>
+      </w:r>
+    </w:p>
+    <w:p>
+      <w:pPr>
+        <w:numPr>
+          <w:ilvl w:val="0"/>
+          <w:numId w:val="6"/>
+        </w:numPr>
+        <w:spacing w:line="276" w:lineRule="auto"/>
+        <w:ind w:left="720" w:hanging="360"/>
+        <w:jc w:val="both"/>
+        <w:rPr>
+          <w:highlight w:val="yellow"/>
+        </w:rPr>
+      </w:pPr>
+      <w:r>
+        <w:rPr>
+          <w:highlight w:val="yellow"/>
+          <w:rtl w:val="0"/>
+        </w:rPr>
+        <w:t xml:space="preserve">Lockdown is lifted when the teacher explicitly ends the exam session or code exit.</w:t>
+      </w:r>
+    </w:p>
+    <w:p>
+      <w:pPr>
+        <w:numPr>
+          <w:ilvl w:val="0"/>
+          <w:numId w:val="6"/>
+        </w:numPr>
+        <w:spacing w:after="240" w:line="276" w:lineRule="auto"/>
+        <w:ind w:left="720" w:hanging="360"/>
+        <w:jc w:val="both"/>
+        <w:rPr>
+          <w:highlight w:val="yellow"/>
+        </w:rPr>
+      </w:pPr>
+      <w:r>
+        <w:rPr>
+          <w:highlight w:val="yellow"/>
+          <w:rtl w:val="0"/>
+        </w:rPr>
+        <w:t xml:space="preserve">Upon launching the application, the system automatically closes all non-essential applications and mutes system audio before the student can access any exam, activity, or assignment.</w:t>
+      </w:r>
+    </w:p>
+    <w:p>
+      <w:pPr>
+        <w:spacing w:after="240" w:before="240" w:line="276" w:lineRule="auto"/>
+        <w:jc w:val="both"/>
+        <w:rPr>
+          <w:b w:val="1"/>
+          <w:bCs w:val="1"/>
+          <w:highlight w:val="yellow"/>
+        </w:rPr>
+      </w:pPr>
+      <w:r>
+        <w:rPr>
+          <w:b w:val="1"/>
+          <w:bCs w:val="1"/>
+          <w:rtl w:val="0"/>
+        </w:rPr>
+        <w:t xml:space="preserve">2</w:t>
+      </w:r>
+      <w:r>
+        <w:rPr>
+          <w:b w:val="1"/>
+          <w:bCs w:val="1"/>
+          <w:highlight w:val="yellow"/>
+          <w:rtl w:val="0"/>
+        </w:rPr>
+        <w:t xml:space="preserve">. Local Code Compiler and Automated Assessment Engine </w:t>
+      </w:r>
+    </w:p>
+    <w:p>
+      <w:pPr>
+        <w:spacing w:after="240" w:before="240" w:line="276" w:lineRule="auto"/>
+        <w:jc w:val="both"/>
+        <w:rPr>
+          <w:highlight w:val="yellow"/>
+        </w:rPr>
+      </w:pPr>
+      <w:r>
+        <w:rPr>
+          <w:highlight w:val="yellow"/>
+          <w:rtl w:val="0"/>
+        </w:rPr>
+        <w:t xml:space="preserve">The platform runs its own code execution engine locally. No external grading API or internet connection is involved.</w:t>
+      </w:r>
+    </w:p>
+    <w:p>
+      <w:pPr>
+        <w:numPr>
+          <w:ilvl w:val="0"/>
           <w:numId w:val="10"/>
         </w:numPr>
-        <w:spacing w:line="276" w:lineRule="auto"/>
-        <w:ind w:left="720" w:hanging="360"/>
-        <w:rPr>
-          <w:highlight w:val="yellow"/>
-        </w:rPr>
-      </w:pPr>
-      <w:r>
-        <w:rPr>
-          <w:highlight w:val="yellow"/>
-          <w:rtl w:val="0"/>
-        </w:rPr>
-        <w:t xml:space="preserve">The system records and monitors student keystroke activity during the examination session for audit and behavioral review.</w:t>
+        <w:spacing w:before="240" w:line="276" w:lineRule="auto"/>
+        <w:ind w:left="720" w:hanging="360"/>
+        <w:jc w:val="both"/>
+        <w:rPr>
+          <w:highlight w:val="yellow"/>
+        </w:rPr>
+      </w:pPr>
+      <w:r>
+        <w:rPr>
+          <w:highlight w:val="yellow"/>
+          <w:rtl w:val="0"/>
+        </w:rPr>
+        <w:t xml:space="preserve">Supports C using compiler and runtime tools pre-installed on the host machine (GCC for C).</w:t>
       </w:r>
     </w:p>
     <w:p>
@@ -478,16 +630,17 @@
         </w:numPr>
         <w:spacing w:line="276" w:lineRule="auto"/>
         <w:ind w:left="720" w:hanging="360"/>
-        <w:rPr>
-          <w:highlight w:val="yellow"/>
-        </w:rPr>
-      </w:pPr>
-      <w:r>
-        <w:rPr>
-          <w:highlight w:val="yellow"/>
-          <w:rtl w:val="0"/>
-        </w:rPr>
-        <w:t xml:space="preserve">Keystroke logs are timestamped and associated with specific question interactions.</w:t>
+        <w:jc w:val="both"/>
+        <w:rPr>
+          <w:highlight w:val="yellow"/>
+        </w:rPr>
+      </w:pPr>
+      <w:r>
+        <w:rPr>
+          <w:highlight w:val="yellow"/>
+          <w:rtl w:val="0"/>
+        </w:rPr>
+        <w:t xml:space="preserve">Students may check their code against the assessment engine before final submission.</w:t>
       </w:r>
     </w:p>
     <w:p>
@@ -498,44 +651,191 @@
         </w:numPr>
         <w:spacing w:line="276" w:lineRule="auto"/>
         <w:ind w:left="720" w:hanging="360"/>
-        <w:rPr>
-          <w:highlight w:val="yellow"/>
-        </w:rPr>
-      </w:pPr>
-      <w:r>
-        <w:rPr>
-          <w:highlight w:val="yellow"/>
-          <w:rtl w:val="0"/>
-        </w:rPr>
-        <w:t xml:space="preserve">Keystroke monitoring applies only during an exam session inside the CodeLit application and is used for academic integrity investigation and incident reporting.</w:t>
-      </w:r>
-    </w:p>
-    <w:p>
-      <w:pPr>
-        <w:numPr>
-          <w:ilvl w:val="0"/>
-          <w:numId w:val="5"/>
-        </w:numPr>
-        <w:spacing w:line="276" w:lineRule="auto"/>
-        <w:ind w:left="720" w:hanging="360"/>
-        <w:jc w:val="both"/>
-        <w:rPr>
-          <w:highlight w:val="yellow"/>
-        </w:rPr>
-      </w:pPr>
-      <w:r>
-        <w:rPr>
-          <w:highlight w:val="yellow"/>
-          <w:rtl w:val="0"/>
-        </w:rPr>
-        <w:t xml:space="preserve">Lockdown is lifted when the teacher explicitly ends the exam session or code exit.</w:t>
-      </w:r>
-    </w:p>
-    <w:p>
-      <w:pPr>
-        <w:numPr>
-          <w:ilvl w:val="0"/>
-          <w:numId w:val="5"/>
+        <w:jc w:val="both"/>
+        <w:rPr>
+          <w:highlight w:val="yellow"/>
+        </w:rPr>
+      </w:pPr>
+      <w:r>
+        <w:rPr>
+          <w:highlight w:val="yellow"/>
+          <w:rtl w:val="0"/>
+        </w:rPr>
+        <w:t xml:space="preserve">Each code check attempt incurs a teacher-configurable point deduction to discourage excessive trial-and-error submissions and encourage problem-solving before verification. </w:t>
+      </w:r>
+    </w:p>
+    <w:p>
+      <w:pPr>
+        <w:numPr>
+          <w:ilvl w:val="0"/>
+          <w:numId w:val="10"/>
+        </w:numPr>
+        <w:spacing w:line="276" w:lineRule="auto"/>
+        <w:ind w:left="720" w:hanging="360"/>
+        <w:jc w:val="both"/>
+        <w:rPr>
+          <w:highlight w:val="yellow"/>
+        </w:rPr>
+      </w:pPr>
+      <w:r>
+        <w:rPr>
+          <w:highlight w:val="yellow"/>
+          <w:rtl w:val="0"/>
+        </w:rPr>
+        <w:t xml:space="preserve">The system records the number of code check attempts made by each student during the examination. </w:t>
+      </w:r>
+    </w:p>
+    <w:p>
+      <w:pPr>
+        <w:numPr>
+          <w:ilvl w:val="0"/>
+          <w:numId w:val="10"/>
+        </w:numPr>
+        <w:spacing w:line="276" w:lineRule="auto"/>
+        <w:ind w:left="720" w:hanging="360"/>
+        <w:jc w:val="both"/>
+        <w:rPr>
+          <w:highlight w:val="yellow"/>
+        </w:rPr>
+      </w:pPr>
+      <w:r>
+        <w:rPr>
+          <w:highlight w:val="yellow"/>
+          <w:rtl w:val="0"/>
+        </w:rPr>
+        <w:t xml:space="preserve">Final scores for coding questions are automatically adjusted based on the configured deduction rules and the student's total number of code check attempts. </w:t>
+      </w:r>
+    </w:p>
+    <w:p>
+      <w:pPr>
+        <w:numPr>
+          <w:ilvl w:val="0"/>
+          <w:numId w:val="10"/>
+        </w:numPr>
+        <w:spacing w:line="276" w:lineRule="auto"/>
+        <w:ind w:left="720" w:hanging="360"/>
+        <w:jc w:val="both"/>
+        <w:rPr>
+          <w:highlight w:val="yellow"/>
+        </w:rPr>
+      </w:pPr>
+      <w:r>
+        <w:rPr>
+          <w:highlight w:val="yellow"/>
+          <w:rtl w:val="0"/>
+        </w:rPr>
+        <w:t xml:space="preserve">On submission, the engine compiles the student's code, runs it against hidden teacher-defined test cases, compares output, and returns a pass/fail result with partial credit scoring.</w:t>
+      </w:r>
+    </w:p>
+    <w:p>
+      <w:pPr>
+        <w:numPr>
+          <w:ilvl w:val="0"/>
+          <w:numId w:val="10"/>
+        </w:numPr>
+        <w:spacing w:line="276" w:lineRule="auto"/>
+        <w:ind w:left="720" w:hanging="360"/>
+        <w:jc w:val="both"/>
+        <w:rPr>
+          <w:highlight w:val="yellow"/>
+        </w:rPr>
+      </w:pPr>
+      <w:r>
+        <w:rPr>
+          <w:highlight w:val="yellow"/>
+          <w:rtl w:val="0"/>
+        </w:rPr>
+        <w:t xml:space="preserve">Each execution runs in process isolation with a configurable time limit and automatic temporary file cleanup.</w:t>
+      </w:r>
+    </w:p>
+    <w:p>
+      <w:pPr>
+        <w:numPr>
+          <w:ilvl w:val="0"/>
+          <w:numId w:val="10"/>
+        </w:numPr>
+        <w:spacing w:line="276" w:lineRule="auto"/>
+        <w:ind w:left="720" w:hanging="360"/>
+        <w:jc w:val="both"/>
+        <w:rPr>
+          <w:highlight w:val="yellow"/>
+        </w:rPr>
+      </w:pPr>
+      <w:r>
+        <w:rPr>
+          <w:highlight w:val="yellow"/>
+          <w:rtl w:val="0"/>
+        </w:rPr>
+        <w:t xml:space="preserve">One student's submission cannot affect another's execution environment.</w:t>
+      </w:r>
+    </w:p>
+    <w:p>
+      <w:pPr>
+        <w:spacing w:after="240" w:before="240" w:line="276" w:lineRule="auto"/>
+        <w:jc w:val="both"/>
+        <w:rPr>
+          <w:b w:val="1"/>
+          <w:bCs w:val="1"/>
+          <w:highlight w:val="yellow"/>
+        </w:rPr>
+      </w:pPr>
+      <w:r>
+        <w:rPr>
+          <w:b w:val="1"/>
+          <w:bCs w:val="1"/>
+          <w:highlight w:val="yellow"/>
+          <w:rtl w:val="0"/>
+        </w:rPr>
+        <w:t xml:space="preserve">3. In-App Code Editor for Students</w:t>
+      </w:r>
+    </w:p>
+    <w:p>
+      <w:pPr>
+        <w:numPr>
+          <w:ilvl w:val="0"/>
+          <w:numId w:val="13"/>
+        </w:numPr>
+        <w:spacing w:before="240" w:line="276" w:lineRule="auto"/>
+        <w:ind w:left="720" w:hanging="360"/>
+        <w:jc w:val="both"/>
+        <w:rPr>
+          <w:highlight w:val="yellow"/>
+        </w:rPr>
+      </w:pPr>
+      <w:r>
+        <w:rPr>
+          <w:highlight w:val="yellow"/>
+          <w:rtl w:val="0"/>
+        </w:rPr>
+        <w:t xml:space="preserve">Students write and run code inside a built-in Monaco editor (the same engine powering Visual Studio Code) rendered within the locked application window.</w:t>
+      </w:r>
+    </w:p>
+    <w:p>
+      <w:pPr>
+        <w:numPr>
+          <w:ilvl w:val="0"/>
+          <w:numId w:val="13"/>
+        </w:numPr>
+        <w:spacing w:line="276" w:lineRule="auto"/>
+        <w:ind w:left="720" w:hanging="360"/>
+        <w:jc w:val="both"/>
+        <w:rPr>
+          <w:highlight w:val="yellow"/>
+        </w:rPr>
+      </w:pPr>
+      <w:r>
+        <w:rPr>
+          <w:highlight w:val="yellow"/>
+          <w:rtl w:val="0"/>
+        </w:rPr>
+        <w:t xml:space="preserve">Students can run their code against visible sample test cases before final submission.</w:t>
+      </w:r>
+    </w:p>
+    <w:p>
+      <w:pPr>
+        <w:numPr>
+          <w:ilvl w:val="0"/>
+          <w:numId w:val="13"/>
         </w:numPr>
         <w:spacing w:after="240" w:line="276" w:lineRule="auto"/>
         <w:ind w:left="720" w:hanging="360"/>
@@ -549,7 +849,7 @@
           <w:highlight w:val="yellow"/>
           <w:rtl w:val="0"/>
         </w:rPr>
-        <w:t xml:space="preserve">Upon launching the application, the system automatically closes all non-essential applications and mutes system audio before the student can access any exam, activity, or assignment.</w:t>
+        <w:t xml:space="preserve">The editor is fully self-contained with no file system access, no external tools, and no browser access.</w:t>
       </w:r>
     </w:p>
     <w:p>
@@ -568,16 +868,58 @@
           <w:bCs w:val="1"/>
           <w:rtl w:val="0"/>
         </w:rPr>
-        <w:t xml:space="preserve">2</w:t>
-      </w:r>
-      <w:r>
-        <w:rPr>
-          <w:b w:val="1"/>
-          <w:bCs w:val="1"/>
-          <w:highlight w:val="yellow"/>
-          <w:rtl w:val="0"/>
-        </w:rPr>
-        <w:t xml:space="preserve">. Local Code Compiler and Automated Assessment Engine </w:t>
+        <w:t xml:space="preserve">4. </w:t>
+      </w:r>
+      <w:r>
+        <w:rPr>
+          <w:b w:val="1"/>
+          <w:bCs w:val="1"/>
+          <w:highlight w:val="yellow"/>
+          <w:rtl w:val="0"/>
+        </w:rPr>
+        <w:t xml:space="preserve">Join by Exam Code</w:t>
+      </w:r>
+    </w:p>
+    <w:p>
+      <w:pPr>
+        <w:numPr>
+          <w:ilvl w:val="0"/>
+          <w:numId w:val="7"/>
+        </w:numPr>
+        <w:spacing w:before="240" w:line="276" w:lineRule="auto"/>
+        <w:ind w:left="720" w:hanging="360"/>
+        <w:jc w:val="both"/>
+        <w:rPr>
+          <w:highlight w:val="yellow"/>
+        </w:rPr>
+      </w:pPr>
+      <w:r>
+        <w:rPr>
+          <w:highlight w:val="yellow"/>
+          <w:rtl w:val="0"/>
+        </w:rPr>
+        <w:t xml:space="preserve">Students join an exam by entering a single-use class code generated by the teacher through the cloud-based exam management system. </w:t>
+      </w:r>
+    </w:p>
+    <w:p>
+      <w:pPr>
+        <w:numPr>
+          <w:ilvl w:val="0"/>
+          <w:numId w:val="7"/>
+        </w:numPr>
+        <w:spacing w:after="240" w:line="276" w:lineRule="auto"/>
+        <w:ind w:left="720" w:hanging="360"/>
+        <w:jc w:val="both"/>
+        <w:rPr>
+          <w:highlight w:val="yellow"/>
+        </w:rPr>
+      </w:pPr>
+      <w:r>
+        <w:rPr>
+          <w:highlight w:val="yellow"/>
+          <w:rtl w:val="0"/>
+        </w:rPr>
+        <w:t xml:space="preserve">Once the exam ends, the session closes and the class code is invalidated automatically.</w:t>
       </w:r>
     </w:p>
     <w:p>
@@ -585,22 +927,24 @@
         <w:spacing w:after="240" w:before="240" w:line="276" w:lineRule="auto"/>
         <w:jc w:val="both"/>
         <w:rPr>
-          <w:highlight w:val="yellow"/>
-        </w:rPr>
-      </w:pPr>
-      <w:r>
-        <w:rPr>
-          <w:highlight w:val="yellow"/>
-          <w:rtl w:val="0"/>
-        </w:rPr>
-        <w:t xml:space="preserve">The platform runs its own code execution engine locally. No external grading API or internet connection is involved.</w:t>
-      </w:r>
-    </w:p>
-    <w:p>
-      <w:pPr>
-        <w:numPr>
-          <w:ilvl w:val="0"/>
-          <w:numId w:val="9"/>
+          <w:b w:val="1"/>
+          <w:bCs w:val="1"/>
+        </w:rPr>
+      </w:pPr>
+      <w:r>
+        <w:rPr>
+          <w:b w:val="1"/>
+          <w:bCs w:val="1"/>
+          <w:rtl w:val="0"/>
+        </w:rPr>
+        <w:t xml:space="preserve">5. Cloud-Based Data Storage and Centralized Management</w:t>
+      </w:r>
+    </w:p>
+    <w:p>
+      <w:pPr>
+        <w:numPr>
+          <w:ilvl w:val="0"/>
+          <w:numId w:val="3"/>
         </w:numPr>
         <w:spacing w:before="240" w:line="276" w:lineRule="auto"/>
         <w:ind w:left="720" w:hanging="360"/>
@@ -614,154 +958,121 @@
           <w:highlight w:val="yellow"/>
           <w:rtl w:val="0"/>
         </w:rPr>
-        <w:t xml:space="preserve">Supports C using compiler and runtime tools pre-installed on the host machine (GCC for C).</w:t>
-      </w:r>
-    </w:p>
-    <w:p>
-      <w:pPr>
-        <w:numPr>
-          <w:ilvl w:val="0"/>
-          <w:numId w:val="9"/>
-        </w:numPr>
-        <w:spacing w:line="276" w:lineRule="auto"/>
-        <w:ind w:left="720" w:hanging="360"/>
-        <w:jc w:val="both"/>
-        <w:rPr>
-          <w:highlight w:val="yellow"/>
-        </w:rPr>
-      </w:pPr>
-      <w:r>
-        <w:rPr>
-          <w:highlight w:val="yellow"/>
-          <w:rtl w:val="0"/>
-        </w:rPr>
-        <w:t xml:space="preserve">Students may check their code against the assessment engine before final submission.</w:t>
-      </w:r>
-    </w:p>
-    <w:p>
-      <w:pPr>
-        <w:numPr>
-          <w:ilvl w:val="0"/>
-          <w:numId w:val="9"/>
-        </w:numPr>
-        <w:spacing w:line="276" w:lineRule="auto"/>
-        <w:ind w:left="720" w:hanging="360"/>
-        <w:jc w:val="both"/>
-        <w:rPr>
-          <w:highlight w:val="yellow"/>
-        </w:rPr>
-      </w:pPr>
-      <w:r>
-        <w:rPr>
-          <w:highlight w:val="yellow"/>
-          <w:rtl w:val="0"/>
-        </w:rPr>
-        <w:t xml:space="preserve">Each code check attempt incurs a teacher-configurable point deduction to discourage excessive trial-and-error submissions and encourage problem-solving before verification. </w:t>
-      </w:r>
-    </w:p>
-    <w:p>
-      <w:pPr>
-        <w:numPr>
-          <w:ilvl w:val="0"/>
-          <w:numId w:val="9"/>
-        </w:numPr>
-        <w:spacing w:line="276" w:lineRule="auto"/>
-        <w:ind w:left="720" w:hanging="360"/>
-        <w:jc w:val="both"/>
-        <w:rPr>
-          <w:highlight w:val="yellow"/>
-        </w:rPr>
-      </w:pPr>
-      <w:r>
-        <w:rPr>
-          <w:highlight w:val="yellow"/>
-          <w:rtl w:val="0"/>
-        </w:rPr>
-        <w:t xml:space="preserve">The system records the number of code check attempts made by each student during the examination. </w:t>
-      </w:r>
-    </w:p>
-    <w:p>
-      <w:pPr>
-        <w:numPr>
-          <w:ilvl w:val="0"/>
-          <w:numId w:val="9"/>
-        </w:numPr>
-        <w:spacing w:line="276" w:lineRule="auto"/>
-        <w:ind w:left="720" w:hanging="360"/>
-        <w:jc w:val="both"/>
-        <w:rPr>
-          <w:highlight w:val="yellow"/>
-        </w:rPr>
-      </w:pPr>
-      <w:r>
-        <w:rPr>
-          <w:highlight w:val="yellow"/>
-          <w:rtl w:val="0"/>
-        </w:rPr>
-        <w:t xml:space="preserve">Final scores for coding questions are automatically adjusted based on the configured deduction rules and the student's total number of code check attempts. </w:t>
-      </w:r>
-    </w:p>
-    <w:p>
-      <w:pPr>
-        <w:numPr>
-          <w:ilvl w:val="0"/>
-          <w:numId w:val="9"/>
-        </w:numPr>
-        <w:spacing w:line="276" w:lineRule="auto"/>
-        <w:ind w:left="720" w:hanging="360"/>
-        <w:jc w:val="both"/>
-        <w:rPr>
-          <w:highlight w:val="yellow"/>
-        </w:rPr>
-      </w:pPr>
-      <w:r>
-        <w:rPr>
-          <w:highlight w:val="yellow"/>
-          <w:rtl w:val="0"/>
-        </w:rPr>
-        <w:t xml:space="preserve">On submission, the engine compiles the student's code, runs it against hidden teacher-defined test cases, compares output, and returns a pass/fail result with partial credit scoring.</w:t>
-      </w:r>
-    </w:p>
-    <w:p>
-      <w:pPr>
-        <w:numPr>
-          <w:ilvl w:val="0"/>
-          <w:numId w:val="9"/>
-        </w:numPr>
-        <w:spacing w:line="276" w:lineRule="auto"/>
-        <w:ind w:left="720" w:hanging="360"/>
-        <w:jc w:val="both"/>
-        <w:rPr>
-          <w:highlight w:val="yellow"/>
-        </w:rPr>
-      </w:pPr>
-      <w:r>
-        <w:rPr>
-          <w:highlight w:val="yellow"/>
-          <w:rtl w:val="0"/>
-        </w:rPr>
-        <w:t xml:space="preserve">Each execution runs in process isolation with a configurable time limit and automatic temporary file cleanup.</w:t>
-      </w:r>
-    </w:p>
-    <w:p>
-      <w:pPr>
-        <w:numPr>
-          <w:ilvl w:val="0"/>
-          <w:numId w:val="9"/>
-        </w:numPr>
-        <w:spacing w:line="276" w:lineRule="auto"/>
-        <w:ind w:left="720" w:hanging="360"/>
-        <w:jc w:val="both"/>
-        <w:rPr>
-          <w:highlight w:val="yellow"/>
-        </w:rPr>
-      </w:pPr>
-      <w:r>
-        <w:rPr>
-          <w:highlight w:val="yellow"/>
-          <w:rtl w:val="0"/>
-        </w:rPr>
-        <w:t xml:space="preserve">One student's submission cannot affect another's execution environment.</w:t>
+        <w:t xml:space="preserve">All exam data, including questions, student answers, scores, violation logs, and exam configurations, is stored in a secure cloud database.</w:t>
+      </w:r>
+    </w:p>
+    <w:p>
+      <w:pPr>
+        <w:numPr>
+          <w:ilvl w:val="0"/>
+          <w:numId w:val="3"/>
+        </w:numPr>
+        <w:spacing w:line="276" w:lineRule="auto"/>
+        <w:ind w:left="720" w:hanging="360"/>
+        <w:jc w:val="both"/>
+        <w:rPr>
+          <w:highlight w:val="yellow"/>
+        </w:rPr>
+      </w:pPr>
+      <w:r>
+        <w:rPr>
+          <w:highlight w:val="yellow"/>
+          <w:rtl w:val="0"/>
+        </w:rPr>
+        <w:t xml:space="preserve">Student responses, progress updates, and assessment results are synchronized.</w:t>
+      </w:r>
+    </w:p>
+    <w:p>
+      <w:pPr>
+        <w:numPr>
+          <w:ilvl w:val="0"/>
+          <w:numId w:val="3"/>
+        </w:numPr>
+        <w:spacing w:line="276" w:lineRule="auto"/>
+        <w:ind w:left="720" w:hanging="360"/>
+        <w:jc w:val="both"/>
+        <w:rPr>
+          <w:highlight w:val="yellow"/>
+        </w:rPr>
+      </w:pPr>
+      <w:r>
+        <w:rPr>
+          <w:highlight w:val="yellow"/>
+          <w:rtl w:val="0"/>
+        </w:rPr>
+        <w:t xml:space="preserve">Data remains available after the exam ends and can be reviewed, exported, or reused for future assessments.</w:t>
+      </w:r>
+    </w:p>
+    <w:p>
+      <w:pPr>
+        <w:numPr>
+          <w:ilvl w:val="0"/>
+          <w:numId w:val="3"/>
+        </w:numPr>
+        <w:spacing w:line="276" w:lineRule="auto"/>
+        <w:ind w:left="720" w:hanging="360"/>
+        <w:jc w:val="both"/>
+        <w:rPr>
+          <w:highlight w:val="yellow"/>
+        </w:rPr>
+      </w:pPr>
+      <w:r>
+        <w:rPr>
+          <w:highlight w:val="yellow"/>
+          <w:rtl w:val="0"/>
+        </w:rPr>
+        <w:t xml:space="preserve">The platform maintains centralized ownership and management of examination records while reducing dependence on local machine storage.</w:t>
+      </w:r>
+    </w:p>
+    <w:p>
+      <w:pPr>
+        <w:numPr>
+          <w:ilvl w:val="0"/>
+          <w:numId w:val="16"/>
+        </w:numPr>
+        <w:spacing w:line="276" w:lineRule="auto"/>
+        <w:ind w:left="720" w:hanging="360"/>
+        <w:rPr/>
+      </w:pPr>
+      <w:r>
+        <w:rPr>
+          <w:rtl w:val="0"/>
+        </w:rPr>
+        <w:t xml:space="preserve">If the student's internet connection is temporarily interrupted during an active examination, the system automatically stores in-progress answers, code drafts, and unsynchronized actions locally using SQLite as a fallback mechanism.</w:t>
+      </w:r>
+    </w:p>
+    <w:p>
+      <w:pPr>
+        <w:numPr>
+          <w:ilvl w:val="0"/>
+          <w:numId w:val="16"/>
+        </w:numPr>
+        <w:spacing w:line="276" w:lineRule="auto"/>
+        <w:ind w:left="720" w:hanging="360"/>
+        <w:rPr/>
+      </w:pPr>
+      <w:r>
+        <w:rPr>
+          <w:rtl w:val="0"/>
+        </w:rPr>
+        <w:t xml:space="preserve">Once connectivity is restored, locally stored data is automatically synchronized with the cloud database to maintain data consistency.</w:t>
+      </w:r>
+    </w:p>
+    <w:p>
+      <w:pPr>
+        <w:numPr>
+          <w:ilvl w:val="0"/>
+          <w:numId w:val="16"/>
+        </w:numPr>
+        <w:spacing w:after="240" w:line="276" w:lineRule="auto"/>
+        <w:ind w:left="720" w:hanging="360"/>
+        <w:rPr/>
+      </w:pPr>
+      <w:r>
+        <w:rPr>
+          <w:rtl w:val="0"/>
+        </w:rPr>
+        <w:t xml:space="preserve">This fallback ensures that temporary connection loss does not result in data loss or interrupted exam progress.</w:t>
       </w:r>
     </w:p>
     <w:p>
@@ -778,10 +1089,18 @@
         <w:rPr>
           <w:b w:val="1"/>
           <w:bCs w:val="1"/>
-          <w:highlight w:val="yellow"/>
-          <w:rtl w:val="0"/>
-        </w:rPr>
-        <w:t xml:space="preserve">3. In-App Code Editor for Students</w:t>
+          <w:rtl w:val="0"/>
+        </w:rPr>
+        <w:t xml:space="preserve">6. </w:t>
+      </w:r>
+      <w:r>
+        <w:rPr>
+          <w:b w:val="1"/>
+          <w:bCs w:val="1"/>
+          <w:highlight w:val="yellow"/>
+          <w:rtl w:val="0"/>
+        </w:rPr>
+        <w:t xml:space="preserve">Cloud-Based Synchronization </w:t>
       </w:r>
     </w:p>
     <w:p>
@@ -802,7 +1121,7 @@
           <w:highlight w:val="yellow"/>
           <w:rtl w:val="0"/>
         </w:rPr>
-        <w:t xml:space="preserve">Students write and run code inside a built-in Monaco editor (the same engine powering Visual Studio Code) rendered within the locked application window.</w:t>
+        <w:t xml:space="preserve">The platform uses cloud-hosted communication services to synchronize exam activities across all connected devices.</w:t>
       </w:r>
     </w:p>
     <w:p>
@@ -810,320 +1129,6 @@
         <w:numPr>
           <w:ilvl w:val="0"/>
           <w:numId w:val="12"/>
-        </w:numPr>
-        <w:spacing w:line="276" w:lineRule="auto"/>
-        <w:ind w:left="720" w:hanging="360"/>
-        <w:jc w:val="both"/>
-        <w:rPr>
-          <w:highlight w:val="yellow"/>
-        </w:rPr>
-      </w:pPr>
-      <w:r>
-        <w:rPr>
-          <w:highlight w:val="yellow"/>
-          <w:rtl w:val="0"/>
-        </w:rPr>
-        <w:t xml:space="preserve">Students can run their code against visible sample test cases before final submission.</w:t>
-      </w:r>
-    </w:p>
-    <w:p>
-      <w:pPr>
-        <w:numPr>
-          <w:ilvl w:val="0"/>
-          <w:numId w:val="12"/>
-        </w:numPr>
-        <w:spacing w:after="240" w:line="276" w:lineRule="auto"/>
-        <w:ind w:left="720" w:hanging="360"/>
-        <w:jc w:val="both"/>
-        <w:rPr>
-          <w:highlight w:val="yellow"/>
-        </w:rPr>
-      </w:pPr>
-      <w:r>
-        <w:rPr>
-          <w:highlight w:val="yellow"/>
-          <w:rtl w:val="0"/>
-        </w:rPr>
-        <w:t xml:space="preserve">The editor is fully self-contained with no file system access, no external tools, and no browser access.</w:t>
-      </w:r>
-    </w:p>
-    <w:p>
-      <w:pPr>
-        <w:spacing w:after="240" w:before="240" w:line="276" w:lineRule="auto"/>
-        <w:jc w:val="both"/>
-        <w:rPr>
-          <w:b w:val="1"/>
-          <w:bCs w:val="1"/>
-          <w:highlight w:val="yellow"/>
-        </w:rPr>
-      </w:pPr>
-      <w:r>
-        <w:rPr>
-          <w:b w:val="1"/>
-          <w:bCs w:val="1"/>
-          <w:rtl w:val="0"/>
-        </w:rPr>
-        <w:t xml:space="preserve">4. </w:t>
-      </w:r>
-      <w:r>
-        <w:rPr>
-          <w:b w:val="1"/>
-          <w:bCs w:val="1"/>
-          <w:highlight w:val="yellow"/>
-          <w:rtl w:val="0"/>
-        </w:rPr>
-        <w:t xml:space="preserve">Join by Exam Code</w:t>
-      </w:r>
-    </w:p>
-    <w:p>
-      <w:pPr>
-        <w:numPr>
-          <w:ilvl w:val="0"/>
-          <w:numId w:val="6"/>
-        </w:numPr>
-        <w:spacing w:before="240" w:line="276" w:lineRule="auto"/>
-        <w:ind w:left="720" w:hanging="360"/>
-        <w:jc w:val="both"/>
-        <w:rPr>
-          <w:highlight w:val="yellow"/>
-        </w:rPr>
-      </w:pPr>
-      <w:r>
-        <w:rPr>
-          <w:highlight w:val="yellow"/>
-          <w:rtl w:val="0"/>
-        </w:rPr>
-        <w:t xml:space="preserve">Students join an exam by entering a single-use class code generated by the teacher through the cloud-based exam management system. </w:t>
-      </w:r>
-    </w:p>
-    <w:p>
-      <w:pPr>
-        <w:numPr>
-          <w:ilvl w:val="0"/>
-          <w:numId w:val="6"/>
-        </w:numPr>
-        <w:spacing w:after="240" w:line="276" w:lineRule="auto"/>
-        <w:ind w:left="720" w:hanging="360"/>
-        <w:jc w:val="both"/>
-        <w:rPr>
-          <w:highlight w:val="yellow"/>
-        </w:rPr>
-      </w:pPr>
-      <w:r>
-        <w:rPr>
-          <w:highlight w:val="yellow"/>
-          <w:rtl w:val="0"/>
-        </w:rPr>
-        <w:t xml:space="preserve">Once the exam ends, the session closes and the class code is invalidated automatically.</w:t>
-      </w:r>
-    </w:p>
-    <w:p>
-      <w:pPr>
-        <w:spacing w:after="240" w:before="240" w:line="276" w:lineRule="auto"/>
-        <w:jc w:val="both"/>
-        <w:rPr>
-          <w:b w:val="1"/>
-          <w:bCs w:val="1"/>
-        </w:rPr>
-      </w:pPr>
-      <w:r>
-        <w:rPr>
-          <w:b w:val="1"/>
-          <w:bCs w:val="1"/>
-          <w:rtl w:val="0"/>
-        </w:rPr>
-        <w:t xml:space="preserve">5. Cloud-Based Data Storage and Centralized Management</w:t>
-      </w:r>
-    </w:p>
-    <w:p>
-      <w:pPr>
-        <w:numPr>
-          <w:ilvl w:val="0"/>
-          <w:numId w:val="3"/>
-        </w:numPr>
-        <w:spacing w:before="240" w:line="276" w:lineRule="auto"/>
-        <w:ind w:left="720" w:hanging="360"/>
-        <w:jc w:val="both"/>
-        <w:rPr>
-          <w:highlight w:val="yellow"/>
-        </w:rPr>
-      </w:pPr>
-      <w:r>
-        <w:rPr>
-          <w:highlight w:val="yellow"/>
-          <w:rtl w:val="0"/>
-        </w:rPr>
-        <w:t xml:space="preserve">All exam data, including questions, student answers, scores, violation logs, and exam configurations, is stored in a secure cloud database.</w:t>
-      </w:r>
-    </w:p>
-    <w:p>
-      <w:pPr>
-        <w:numPr>
-          <w:ilvl w:val="0"/>
-          <w:numId w:val="3"/>
-        </w:numPr>
-        <w:spacing w:line="276" w:lineRule="auto"/>
-        <w:ind w:left="720" w:hanging="360"/>
-        <w:jc w:val="both"/>
-        <w:rPr>
-          <w:highlight w:val="yellow"/>
-        </w:rPr>
-      </w:pPr>
-      <w:r>
-        <w:rPr>
-          <w:highlight w:val="yellow"/>
-          <w:rtl w:val="0"/>
-        </w:rPr>
-        <w:t xml:space="preserve">Student responses, progress updates, and assessment results are synchronized.</w:t>
-      </w:r>
-    </w:p>
-    <w:p>
-      <w:pPr>
-        <w:numPr>
-          <w:ilvl w:val="0"/>
-          <w:numId w:val="3"/>
-        </w:numPr>
-        <w:spacing w:line="276" w:lineRule="auto"/>
-        <w:ind w:left="720" w:hanging="360"/>
-        <w:jc w:val="both"/>
-        <w:rPr>
-          <w:highlight w:val="yellow"/>
-        </w:rPr>
-      </w:pPr>
-      <w:r>
-        <w:rPr>
-          <w:highlight w:val="yellow"/>
-          <w:rtl w:val="0"/>
-        </w:rPr>
-        <w:t xml:space="preserve">Data remains available after the exam ends and can be reviewed, exported, or reused for future assessments.</w:t>
-      </w:r>
-    </w:p>
-    <w:p>
-      <w:pPr>
-        <w:numPr>
-          <w:ilvl w:val="0"/>
-          <w:numId w:val="3"/>
-        </w:numPr>
-        <w:spacing w:line="276" w:lineRule="auto"/>
-        <w:ind w:left="720" w:hanging="360"/>
-        <w:jc w:val="both"/>
-        <w:rPr>
-          <w:highlight w:val="yellow"/>
-        </w:rPr>
-      </w:pPr>
-      <w:r>
-        <w:rPr>
-          <w:highlight w:val="yellow"/>
-          <w:rtl w:val="0"/>
-        </w:rPr>
-        <w:t xml:space="preserve">The platform maintains centralized ownership and management of examination records while reducing dependence on local machine storage.</w:t>
-      </w:r>
-    </w:p>
-    <w:p>
-      <w:pPr>
-        <w:numPr>
-          <w:ilvl w:val="0"/>
-          <w:numId w:val="15"/>
-        </w:numPr>
-        <w:spacing w:line="276" w:lineRule="auto"/>
-        <w:ind w:left="720" w:hanging="360"/>
-        <w:rPr/>
-      </w:pPr>
-      <w:r>
-        <w:rPr>
-          <w:rtl w:val="0"/>
-        </w:rPr>
-        <w:t xml:space="preserve">If the student's internet connection is temporarily interrupted during an active examination, the system automatically stores in-progress answers, code drafts, and unsynchronized actions locally using SQLite as a fallback mechanism.</w:t>
-      </w:r>
-    </w:p>
-    <w:p>
-      <w:pPr>
-        <w:numPr>
-          <w:ilvl w:val="0"/>
-          <w:numId w:val="15"/>
-        </w:numPr>
-        <w:spacing w:line="276" w:lineRule="auto"/>
-        <w:ind w:left="720" w:hanging="360"/>
-        <w:rPr/>
-      </w:pPr>
-      <w:r>
-        <w:rPr>
-          <w:rtl w:val="0"/>
-        </w:rPr>
-        <w:t xml:space="preserve">Once connectivity is restored, locally stored data is automatically synchronized with the cloud database to maintain data consistency.</w:t>
-      </w:r>
-    </w:p>
-    <w:p>
-      <w:pPr>
-        <w:numPr>
-          <w:ilvl w:val="0"/>
-          <w:numId w:val="15"/>
-        </w:numPr>
-        <w:spacing w:after="240" w:line="276" w:lineRule="auto"/>
-        <w:ind w:left="720" w:hanging="360"/>
-        <w:rPr/>
-      </w:pPr>
-      <w:r>
-        <w:rPr>
-          <w:rtl w:val="0"/>
-        </w:rPr>
-        <w:t xml:space="preserve">This fallback ensures that temporary connection loss does not result in data loss or interrupted exam progress.</w:t>
-      </w:r>
-    </w:p>
-    <w:p>
-      <w:pPr>
-        <w:spacing w:after="240" w:before="240" w:line="276" w:lineRule="auto"/>
-        <w:jc w:val="both"/>
-        <w:rPr>
-          <w:b w:val="1"/>
-          <w:bCs w:val="1"/>
-          <w:highlight w:val="yellow"/>
-        </w:rPr>
-      </w:pPr>
-      <w:r>
-        <w:rPr>
-          <w:b w:val="1"/>
-          <w:bCs w:val="1"/>
-          <w:rtl w:val="0"/>
-        </w:rPr>
-        <w:t xml:space="preserve">6. </w:t>
-      </w:r>
-      <w:r>
-        <w:rPr>
-          <w:b w:val="1"/>
-          <w:bCs w:val="1"/>
-          <w:highlight w:val="yellow"/>
-          <w:rtl w:val="0"/>
-        </w:rPr>
-        <w:t xml:space="preserve">Cloud-Based Synchronization </w:t>
-      </w:r>
-    </w:p>
-    <w:p>
-      <w:pPr>
-        <w:numPr>
-          <w:ilvl w:val="0"/>
-          <w:numId w:val="11"/>
-        </w:numPr>
-        <w:spacing w:before="240" w:line="276" w:lineRule="auto"/>
-        <w:ind w:left="720" w:hanging="360"/>
-        <w:jc w:val="both"/>
-        <w:rPr>
-          <w:highlight w:val="yellow"/>
-        </w:rPr>
-      </w:pPr>
-      <w:r>
-        <w:rPr>
-          <w:highlight w:val="yellow"/>
-          <w:rtl w:val="0"/>
-        </w:rPr>
-        <w:t xml:space="preserve">The platform uses cloud-hosted communication services to synchronize exam activities across all connected devices.</w:t>
-      </w:r>
-    </w:p>
-    <w:p>
-      <w:pPr>
-        <w:numPr>
-          <w:ilvl w:val="0"/>
-          <w:numId w:val="11"/>
         </w:numPr>
         <w:spacing w:line="276" w:lineRule="auto"/>
         <w:ind w:left="720" w:hanging="360"/>
@@ -1327,7 +1332,7 @@
       <w:pPr>
         <w:numPr>
           <w:ilvl w:val="0"/>
-          <w:numId w:val="4"/>
+          <w:numId w:val="5"/>
         </w:numPr>
         <w:spacing w:before="240" w:line="276" w:lineRule="auto"/>
         <w:ind w:left="720" w:hanging="360"/>
@@ -1348,7 +1353,7 @@
       <w:pPr>
         <w:numPr>
           <w:ilvl w:val="0"/>
-          <w:numId w:val="4"/>
+          <w:numId w:val="5"/>
         </w:numPr>
         <w:spacing w:line="276" w:lineRule="auto"/>
         <w:ind w:left="720" w:hanging="360"/>
@@ -1365,7 +1370,7 @@
       <w:pPr>
         <w:numPr>
           <w:ilvl w:val="0"/>
-          <w:numId w:val="4"/>
+          <w:numId w:val="5"/>
         </w:numPr>
         <w:spacing w:line="276" w:lineRule="auto"/>
         <w:ind w:left="720" w:hanging="360"/>
@@ -1386,7 +1391,7 @@
       <w:pPr>
         <w:numPr>
           <w:ilvl w:val="0"/>
-          <w:numId w:val="4"/>
+          <w:numId w:val="5"/>
         </w:numPr>
         <w:spacing w:line="276" w:lineRule="auto"/>
         <w:ind w:left="720" w:hanging="360"/>
@@ -1403,7 +1408,7 @@
       <w:pPr>
         <w:numPr>
           <w:ilvl w:val="0"/>
-          <w:numId w:val="4"/>
+          <w:numId w:val="5"/>
         </w:numPr>
         <w:spacing w:line="276" w:lineRule="auto"/>
         <w:ind w:left="720" w:hanging="360"/>
@@ -1420,7 +1425,7 @@
       <w:pPr>
         <w:numPr>
           <w:ilvl w:val="0"/>
-          <w:numId w:val="4"/>
+          <w:numId w:val="5"/>
         </w:numPr>
         <w:spacing w:line="276" w:lineRule="auto"/>
         <w:ind w:left="720" w:hanging="360"/>
@@ -1481,17 +1486,392 @@
       <w:pPr>
         <w:numPr>
           <w:ilvl w:val="0"/>
+          <w:numId w:val="15"/>
+        </w:numPr>
+        <w:spacing w:before="240" w:line="276" w:lineRule="auto"/>
+        <w:ind w:left="720" w:hanging="360"/>
+        <w:jc w:val="both"/>
+      </w:pPr>
+      <w:r>
+        <w:rPr>
+          <w:rtl w:val="0"/>
+        </w:rPr>
+        <w:t xml:space="preserve">Fill in the Blanks</w:t>
+      </w:r>
+    </w:p>
+    <w:p>
+      <w:pPr>
+        <w:numPr>
+          <w:ilvl w:val="0"/>
+          <w:numId w:val="15"/>
+        </w:numPr>
+        <w:spacing w:line="276" w:lineRule="auto"/>
+        <w:ind w:left="720" w:hanging="360"/>
+        <w:jc w:val="both"/>
+        <w:rPr>
+          <w:highlight w:val="yellow"/>
+        </w:rPr>
+      </w:pPr>
+      <w:r>
+        <w:rPr>
+          <w:highlight w:val="yellow"/>
+          <w:rtl w:val="0"/>
+        </w:rPr>
+        <w:t xml:space="preserve">Multiple Choice</w:t>
+      </w:r>
+    </w:p>
+    <w:p>
+      <w:pPr>
+        <w:numPr>
+          <w:ilvl w:val="0"/>
+          <w:numId w:val="15"/>
+        </w:numPr>
+        <w:spacing w:after="240" w:line="276" w:lineRule="auto"/>
+        <w:ind w:left="720" w:hanging="360"/>
+        <w:jc w:val="both"/>
+        <w:rPr>
+          <w:highlight w:val="yellow"/>
+        </w:rPr>
+      </w:pPr>
+      <w:r>
+        <w:rPr>
+          <w:highlight w:val="yellow"/>
+          <w:rtl w:val="0"/>
+        </w:rPr>
+        <w:t xml:space="preserve">Coding</w:t>
+      </w:r>
+    </w:p>
+    <w:p>
+      <w:pPr>
+        <w:spacing w:after="240" w:before="240" w:line="276" w:lineRule="auto"/>
+        <w:jc w:val="both"/>
+        <w:rPr/>
+      </w:pPr>
+      <w:r>
+        <w:rPr>
+          <w:rtl w:val="0"/>
+        </w:rPr>
+        <w:t xml:space="preserve">Additional exam builder features:</w:t>
+      </w:r>
+    </w:p>
+    <w:p>
+      <w:pPr>
+        <w:numPr>
+          <w:ilvl w:val="0"/>
           <w:numId w:val="14"/>
         </w:numPr>
+        <w:spacing w:line="276" w:lineRule="auto"/>
+        <w:ind w:left="720" w:hanging="360"/>
+        <w:jc w:val="both"/>
+      </w:pPr>
+      <w:r>
+        <w:rPr>
+          <w:rtl w:val="0"/>
+        </w:rPr>
+        <w:t xml:space="preserve">Fill-in-the-Blank Question Builder </w:t>
+      </w:r>
+    </w:p>
+    <w:p>
+      <w:pPr>
+        <w:numPr>
+          <w:ilvl w:val="1"/>
+          <w:numId w:val="14"/>
+        </w:numPr>
+        <w:spacing w:line="276" w:lineRule="auto"/>
+        <w:ind w:left="1440" w:hanging="360"/>
+        <w:jc w:val="both"/>
+      </w:pPr>
+      <w:r>
+        <w:rPr>
+          <w:rtl w:val="0"/>
+        </w:rPr>
+        <w:t xml:space="preserve">Create questions with one or more acceptable answers </w:t>
+      </w:r>
+    </w:p>
+    <w:p>
+      <w:pPr>
+        <w:numPr>
+          <w:ilvl w:val="1"/>
+          <w:numId w:val="14"/>
+        </w:numPr>
+        <w:spacing w:line="276" w:lineRule="auto"/>
+        <w:ind w:left="1440" w:hanging="360"/>
+        <w:jc w:val="both"/>
+      </w:pPr>
+      <w:r>
+        <w:rPr>
+          <w:rtl w:val="0"/>
+        </w:rPr>
+        <w:t xml:space="preserve">Configure case sensitivity and answer matching rules </w:t>
+      </w:r>
+    </w:p>
+    <w:p>
+      <w:pPr>
+        <w:numPr>
+          <w:ilvl w:val="1"/>
+          <w:numId w:val="14"/>
+        </w:numPr>
+        <w:spacing w:line="276" w:lineRule="auto"/>
+        <w:ind w:left="1440" w:hanging="360"/>
+        <w:jc w:val="both"/>
+      </w:pPr>
+      <w:r>
+        <w:rPr>
+          <w:rtl w:val="0"/>
+        </w:rPr>
+        <w:t xml:space="preserve">Configure point values for each question </w:t>
+      </w:r>
+    </w:p>
+    <w:p>
+      <w:pPr>
+        <w:numPr>
+          <w:ilvl w:val="0"/>
+          <w:numId w:val="14"/>
+        </w:numPr>
+        <w:spacing w:line="276" w:lineRule="auto"/>
+        <w:ind w:left="720" w:hanging="360"/>
+        <w:jc w:val="both"/>
+        <w:rPr>
+          <w:highlight w:val="yellow"/>
+        </w:rPr>
+      </w:pPr>
+      <w:r>
+        <w:rPr>
+          <w:highlight w:val="yellow"/>
+          <w:rtl w:val="0"/>
+        </w:rPr>
+        <w:t xml:space="preserve">Multiple Choice Question Builder </w:t>
+      </w:r>
+    </w:p>
+    <w:p>
+      <w:pPr>
+        <w:numPr>
+          <w:ilvl w:val="1"/>
+          <w:numId w:val="14"/>
+        </w:numPr>
+        <w:spacing w:line="276" w:lineRule="auto"/>
+        <w:ind w:left="1440" w:hanging="360"/>
+        <w:jc w:val="both"/>
+        <w:rPr>
+          <w:highlight w:val="yellow"/>
+        </w:rPr>
+      </w:pPr>
+      <w:r>
+        <w:rPr>
+          <w:highlight w:val="yellow"/>
+          <w:rtl w:val="0"/>
+        </w:rPr>
+        <w:t xml:space="preserve">Create questions, answer choices, and correct answers </w:t>
+      </w:r>
+    </w:p>
+    <w:p>
+      <w:pPr>
+        <w:numPr>
+          <w:ilvl w:val="1"/>
+          <w:numId w:val="14"/>
+        </w:numPr>
+        <w:spacing w:line="276" w:lineRule="auto"/>
+        <w:ind w:left="1440" w:hanging="360"/>
+        <w:jc w:val="both"/>
+        <w:rPr>
+          <w:highlight w:val="yellow"/>
+        </w:rPr>
+      </w:pPr>
+      <w:r>
+        <w:rPr>
+          <w:highlight w:val="yellow"/>
+          <w:rtl w:val="0"/>
+        </w:rPr>
+        <w:t xml:space="preserve">Configure point values for each question </w:t>
+      </w:r>
+    </w:p>
+    <w:p>
+      <w:pPr>
+        <w:numPr>
+          <w:ilvl w:val="0"/>
+          <w:numId w:val="14"/>
+        </w:numPr>
+        <w:spacing w:line="276" w:lineRule="auto"/>
+        <w:ind w:left="720" w:hanging="360"/>
+        <w:jc w:val="both"/>
+        <w:rPr>
+          <w:highlight w:val="yellow"/>
+        </w:rPr>
+      </w:pPr>
+      <w:r>
+        <w:rPr>
+          <w:highlight w:val="yellow"/>
+          <w:rtl w:val="0"/>
+        </w:rPr>
+        <w:t xml:space="preserve">Coding Question Builder </w:t>
+      </w:r>
+    </w:p>
+    <w:p>
+      <w:pPr>
+        <w:numPr>
+          <w:ilvl w:val="1"/>
+          <w:numId w:val="14"/>
+        </w:numPr>
+        <w:spacing w:line="276" w:lineRule="auto"/>
+        <w:ind w:left="1440" w:hanging="360"/>
+        <w:jc w:val="both"/>
+        <w:rPr>
+          <w:highlight w:val="yellow"/>
+        </w:rPr>
+      </w:pPr>
+      <w:r>
+        <w:rPr>
+          <w:highlight w:val="yellow"/>
+          <w:rtl w:val="0"/>
+        </w:rPr>
+        <w:t xml:space="preserve">Create programming problems with custom problem statements, input specifications, output specifications, and constraints </w:t>
+      </w:r>
+    </w:p>
+    <w:p>
+      <w:pPr>
+        <w:numPr>
+          <w:ilvl w:val="1"/>
+          <w:numId w:val="14"/>
+        </w:numPr>
+        <w:spacing w:line="276" w:lineRule="auto"/>
+        <w:ind w:left="1440" w:hanging="360"/>
+        <w:jc w:val="both"/>
+        <w:rPr>
+          <w:highlight w:val="yellow"/>
+        </w:rPr>
+      </w:pPr>
+      <w:r>
+        <w:rPr>
+          <w:highlight w:val="yellow"/>
+          <w:rtl w:val="0"/>
+        </w:rPr>
+        <w:t xml:space="preserve">Define visible sample test cases for student practice </w:t>
+      </w:r>
+    </w:p>
+    <w:p>
+      <w:pPr>
+        <w:numPr>
+          <w:ilvl w:val="1"/>
+          <w:numId w:val="14"/>
+        </w:numPr>
+        <w:spacing w:line="276" w:lineRule="auto"/>
+        <w:ind w:left="1440" w:hanging="360"/>
+        <w:jc w:val="both"/>
+        <w:rPr>
+          <w:highlight w:val="yellow"/>
+        </w:rPr>
+      </w:pPr>
+      <w:r>
+        <w:rPr>
+          <w:highlight w:val="yellow"/>
+          <w:rtl w:val="0"/>
+        </w:rPr>
+        <w:t xml:space="preserve">Define hidden test cases used for automated grading</w:t>
+      </w:r>
+    </w:p>
+    <w:p>
+      <w:pPr>
+        <w:numPr>
+          <w:ilvl w:val="1"/>
+          <w:numId w:val="14"/>
+        </w:numPr>
+        <w:spacing w:line="276" w:lineRule="auto"/>
+        <w:ind w:left="1440" w:hanging="360"/>
+        <w:jc w:val="both"/>
+        <w:rPr>
+          <w:highlight w:val="yellow"/>
+        </w:rPr>
+      </w:pPr>
+      <w:r>
+        <w:rPr>
+          <w:highlight w:val="yellow"/>
+          <w:rtl w:val="0"/>
+        </w:rPr>
+        <w:t xml:space="preserve">Specify expected outputs for each test case </w:t>
+      </w:r>
+    </w:p>
+    <w:p>
+      <w:pPr>
+        <w:numPr>
+          <w:ilvl w:val="1"/>
+          <w:numId w:val="14"/>
+        </w:numPr>
+        <w:spacing w:line="276" w:lineRule="auto"/>
+        <w:ind w:left="1440" w:hanging="360"/>
+        <w:jc w:val="both"/>
+        <w:rPr>
+          <w:highlight w:val="yellow"/>
+        </w:rPr>
+      </w:pPr>
+      <w:r>
+        <w:rPr>
+          <w:highlight w:val="yellow"/>
+          <w:rtl w:val="0"/>
+        </w:rPr>
+        <w:t xml:space="preserve">Configure time limits and scoring criteria for submissions </w:t>
+      </w:r>
+    </w:p>
+    <w:p>
+      <w:pPr>
+        <w:numPr>
+          <w:ilvl w:val="1"/>
+          <w:numId w:val="14"/>
+        </w:numPr>
+        <w:spacing w:line="276" w:lineRule="auto"/>
+        <w:ind w:left="1440" w:hanging="360"/>
+        <w:jc w:val="both"/>
+        <w:rPr>
+          <w:highlight w:val="yellow"/>
+        </w:rPr>
+      </w:pPr>
+      <w:r>
+        <w:rPr>
+          <w:highlight w:val="yellow"/>
+          <w:rtl w:val="0"/>
+        </w:rPr>
+        <w:t xml:space="preserve">Teachers can give out “check” penalties.</w:t>
+      </w:r>
+    </w:p>
+    <w:p>
+      <w:pPr>
+        <w:numPr>
+          <w:ilvl w:val="1"/>
+          <w:numId w:val="14"/>
+        </w:numPr>
+        <w:spacing w:line="276" w:lineRule="auto"/>
+        <w:ind w:left="1440" w:hanging="360"/>
+        <w:jc w:val="both"/>
+        <w:rPr>
+          <w:highlight w:val="yellow"/>
+        </w:rPr>
+      </w:pPr>
+      <w:r>
+        <w:rPr>
+          <w:highlight w:val="yellow"/>
+          <w:rtl w:val="0"/>
+        </w:rPr>
+        <w:t xml:space="preserve">Preview and validate test cases before publishing the exam </w:t>
+      </w:r>
+    </w:p>
+    <w:p>
+      <w:pPr>
+        <w:numPr>
+          <w:ilvl w:val="0"/>
+          <w:numId w:val="14"/>
+        </w:numPr>
         <w:spacing w:before="240" w:line="276" w:lineRule="auto"/>
         <w:ind w:left="720" w:hanging="360"/>
         <w:jc w:val="both"/>
-      </w:pPr>
-      <w:r>
-        <w:rPr>
-          <w:rtl w:val="0"/>
-        </w:rPr>
-        <w:t xml:space="preserve">Fill in the Blanks</w:t>
+        <w:rPr>
+          <w:highlight w:val="yellow"/>
+        </w:rPr>
+      </w:pPr>
+      <w:r>
+        <w:rPr>
+          <w:highlight w:val="yellow"/>
+          <w:rtl w:val="0"/>
+        </w:rPr>
+        <w:t xml:space="preserve">Hidden test cases are used exclusively for automated grading and are never visible to students during the examination. </w:t>
       </w:r>
     </w:p>
     <w:p>
@@ -1512,7 +1892,7 @@
           <w:highlight w:val="yellow"/>
           <w:rtl w:val="0"/>
         </w:rPr>
-        <w:t xml:space="preserve">Multiple Choice</w:t>
+        <w:t xml:space="preserve">Question order can be randomized per student to reduce answer sharing.</w:t>
       </w:r>
     </w:p>
     <w:p>
@@ -1524,698 +1904,436 @@
         <w:spacing w:after="240" w:line="276" w:lineRule="auto"/>
         <w:ind w:left="720" w:hanging="360"/>
         <w:jc w:val="both"/>
-        <w:rPr>
-          <w:highlight w:val="yellow"/>
-        </w:rPr>
-      </w:pPr>
-      <w:r>
-        <w:rPr>
-          <w:highlight w:val="yellow"/>
-          <w:rtl w:val="0"/>
-        </w:rPr>
-        <w:t xml:space="preserve">Coding</w:t>
+      </w:pPr>
+      <w:r>
+        <w:rPr>
+          <w:rtl w:val="0"/>
+        </w:rPr>
+        <w:t xml:space="preserve">The teacher portal is web-based and accessible through the cloud-based platform from any authorized device.</w:t>
+      </w:r>
+    </w:p>
+    <w:p>
+      <w:pPr>
+        <w:numPr>
+          <w:ilvl w:val="0"/>
+          <w:numId w:val="14"/>
+        </w:numPr>
+        <w:spacing w:after="240" w:line="276" w:lineRule="auto"/>
+        <w:ind w:left="720" w:hanging="360"/>
+        <w:jc w:val="both"/>
+      </w:pPr>
+      <w:r>
+        <w:rPr>
+          <w:rtl w:val="0"/>
+        </w:rPr>
+        <w:t xml:space="preserve">Teacher can update scores</w:t>
       </w:r>
     </w:p>
     <w:p>
       <w:pPr>
         <w:spacing w:after="240" w:before="240" w:line="276" w:lineRule="auto"/>
         <w:jc w:val="both"/>
+        <w:rPr>
+          <w:b w:val="1"/>
+          <w:bCs w:val="1"/>
+        </w:rPr>
+      </w:pPr>
+      <w:r>
+        <w:rPr>
+          <w:b w:val="1"/>
+          <w:bCs w:val="1"/>
+          <w:rtl w:val="0"/>
+        </w:rPr>
+        <w:t xml:space="preserve">3. </w:t>
+      </w:r>
+      <w:r>
+        <w:rPr>
+          <w:b w:val="1"/>
+          <w:bCs w:val="1"/>
+          <w:highlight w:val="yellow"/>
+          <w:rtl w:val="0"/>
+        </w:rPr>
+        <w:t xml:space="preserve">Result and Incident Report Export</w:t>
+      </w:r>
+      <w:r>
+        <w:rPr>
+          <w:rtl w:val="0"/>
+        </w:rPr>
+      </w:r>
+    </w:p>
+    <w:p>
+      <w:pPr>
+        <w:numPr>
+          <w:ilvl w:val="0"/>
+          <w:numId w:val="1"/>
+        </w:numPr>
+        <w:spacing w:before="240" w:line="276" w:lineRule="auto"/>
+        <w:ind w:left="720" w:hanging="360"/>
+        <w:jc w:val="both"/>
+        <w:rPr>
+          <w:highlight w:val="yellow"/>
+        </w:rPr>
+      </w:pPr>
+      <w:r>
+        <w:rPr>
+          <w:highlight w:val="yellow"/>
+          <w:rtl w:val="0"/>
+        </w:rPr>
+        <w:t xml:space="preserve">After the exam, the teacher can export a full results sheet as a CSV file.</w:t>
+      </w:r>
+    </w:p>
+    <w:p>
+      <w:pPr>
+        <w:numPr>
+          <w:ilvl w:val="0"/>
+          <w:numId w:val="1"/>
+        </w:numPr>
+        <w:spacing w:line="276" w:lineRule="auto"/>
+        <w:ind w:left="720" w:hanging="360"/>
+        <w:jc w:val="both"/>
+        <w:rPr>
+          <w:highlight w:val="yellow"/>
+        </w:rPr>
+      </w:pPr>
+      <w:r>
+        <w:rPr>
+          <w:highlight w:val="yellow"/>
+          <w:rtl w:val="0"/>
+        </w:rPr>
+        <w:t xml:space="preserve">Results include per-student scores broken down by question.</w:t>
+      </w:r>
+    </w:p>
+    <w:p>
+      <w:pPr>
+        <w:numPr>
+          <w:ilvl w:val="0"/>
+          <w:numId w:val="1"/>
+        </w:numPr>
+        <w:spacing w:line="276" w:lineRule="auto"/>
+        <w:ind w:left="720" w:hanging="360"/>
+        <w:jc w:val="both"/>
+      </w:pPr>
+      <w:r>
+        <w:rPr>
+          <w:rtl w:val="0"/>
+        </w:rPr>
+        <w:t xml:space="preserve">The incident report lists all logged violations with timestamps.</w:t>
+      </w:r>
+    </w:p>
+    <w:p>
+      <w:pPr>
+        <w:numPr>
+          <w:ilvl w:val="0"/>
+          <w:numId w:val="1"/>
+        </w:numPr>
+        <w:spacing w:after="240" w:line="276" w:lineRule="auto"/>
+        <w:ind w:left="720" w:hanging="360"/>
+        <w:jc w:val="both"/>
+      </w:pPr>
+      <w:r>
+        <w:rPr>
+          <w:rtl w:val="0"/>
+        </w:rPr>
+        <w:t xml:space="preserve">Exports are generated immediately after the exam ends with no additional configuration.</w:t>
+      </w:r>
+    </w:p>
+    <w:p>
+      <w:pPr>
+        <w:spacing w:after="240" w:before="240" w:line="276" w:lineRule="auto"/>
+        <w:jc w:val="both"/>
+        <w:rPr>
+          <w:b w:val="1"/>
+          <w:bCs w:val="1"/>
+          <w:highlight w:val="yellow"/>
+        </w:rPr>
+      </w:pPr>
+      <w:r>
+        <w:rPr>
+          <w:b w:val="1"/>
+          <w:bCs w:val="1"/>
+          <w:highlight w:val="yellow"/>
+          <w:rtl w:val="0"/>
+        </w:rPr>
+        <w:t xml:space="preserve">4. Cloud-Based Synchronization </w:t>
+      </w:r>
+    </w:p>
+    <w:p>
+      <w:pPr>
+        <w:numPr>
+          <w:ilvl w:val="0"/>
+          <w:numId w:val="5"/>
+        </w:numPr>
+        <w:spacing w:line="276" w:lineRule="auto"/>
+        <w:ind w:left="720" w:hanging="360"/>
+        <w:jc w:val="both"/>
+        <w:rPr>
+          <w:highlight w:val="yellow"/>
+        </w:rPr>
+      </w:pPr>
+      <w:r>
+        <w:rPr>
+          <w:highlight w:val="yellow"/>
+          <w:rtl w:val="0"/>
+        </w:rPr>
+        <w:t xml:space="preserve">Exam delivery, </w:t>
+      </w:r>
+    </w:p>
+    <w:p>
+      <w:pPr>
+        <w:numPr>
+          <w:ilvl w:val="0"/>
+          <w:numId w:val="5"/>
+        </w:numPr>
+        <w:spacing w:line="276" w:lineRule="auto"/>
+        <w:ind w:left="720" w:hanging="360"/>
+        <w:jc w:val="both"/>
+        <w:rPr>
+          <w:highlight w:val="yellow"/>
+        </w:rPr>
+      </w:pPr>
+      <w:r>
+        <w:rPr>
+          <w:highlight w:val="yellow"/>
+          <w:rtl w:val="0"/>
+        </w:rPr>
+        <w:t xml:space="preserve">Student progress updates</w:t>
+      </w:r>
+    </w:p>
+    <w:p>
+      <w:pPr>
+        <w:numPr>
+          <w:ilvl w:val="0"/>
+          <w:numId w:val="5"/>
+        </w:numPr>
+        <w:spacing w:line="276" w:lineRule="auto"/>
+        <w:ind w:left="720" w:hanging="360"/>
+        <w:jc w:val="both"/>
+      </w:pPr>
+      <w:r>
+        <w:rPr>
+          <w:rtl w:val="0"/>
+        </w:rPr>
+        <w:t xml:space="preserve">V</w:t>
+      </w:r>
+      <w:r>
+        <w:rPr>
+          <w:rtl w:val="0"/>
+        </w:rPr>
+        <w:t xml:space="preserve">iolation alerts</w:t>
+      </w:r>
+    </w:p>
+    <w:p>
+      <w:pPr>
+        <w:numPr>
+          <w:ilvl w:val="0"/>
+          <w:numId w:val="5"/>
+        </w:numPr>
+        <w:spacing w:line="276" w:lineRule="auto"/>
+        <w:ind w:left="720" w:hanging="360"/>
+        <w:jc w:val="both"/>
+        <w:rPr>
+          <w:highlight w:val="yellow"/>
+        </w:rPr>
+      </w:pPr>
+      <w:r>
+        <w:rPr>
+          <w:highlight w:val="yellow"/>
+          <w:rtl w:val="0"/>
+        </w:rPr>
+        <w:t xml:space="preserve">Submission results.</w:t>
+      </w:r>
+    </w:p>
+    <w:p>
+      <w:pPr>
+        <w:numPr>
+          <w:ilvl w:val="0"/>
+          <w:numId w:val="5"/>
+        </w:numPr>
+        <w:spacing w:line="276" w:lineRule="auto"/>
+        <w:ind w:left="720" w:hanging="360"/>
+        <w:jc w:val="both"/>
+        <w:rPr>
+          <w:highlight w:val="yellow"/>
+        </w:rPr>
+      </w:pPr>
+      <w:r>
+        <w:rPr>
+          <w:highlight w:val="yellow"/>
+          <w:rtl w:val="0"/>
+        </w:rPr>
+        <w:t xml:space="preserve">Teachers receive live updates through the monitoring dashboard regardless of device location. </w:t>
+      </w:r>
+    </w:p>
+    <w:p>
+      <w:pPr>
+        <w:spacing w:after="240" w:before="240" w:line="276" w:lineRule="auto"/>
+        <w:jc w:val="both"/>
+        <w:rPr>
+          <w:b w:val="1"/>
+          <w:bCs w:val="1"/>
+          <w:highlight w:val="yellow"/>
+        </w:rPr>
+      </w:pPr>
+      <w:r>
+        <w:rPr>
+          <w:b w:val="1"/>
+          <w:bCs w:val="1"/>
+          <w:highlight w:val="yellow"/>
+          <w:rtl w:val="0"/>
+        </w:rPr>
+        <w:t xml:space="preserve">5. Admin Dashboard </w:t>
+      </w:r>
+    </w:p>
+    <w:p>
+      <w:pPr>
+        <w:spacing w:after="240" w:before="240" w:line="276" w:lineRule="auto"/>
+        <w:jc w:val="both"/>
+        <w:rPr>
+          <w:highlight w:val="yellow"/>
+        </w:rPr>
+      </w:pPr>
+      <w:r>
+        <w:rPr>
+          <w:highlight w:val="yellow"/>
+          <w:rtl w:val="0"/>
+        </w:rPr>
+        <w:t xml:space="preserve">The admin dashboard provides centralized administrative control over teacher accounts and system access management through the web-based platform.</w:t>
+      </w:r>
+    </w:p>
+    <w:p>
+      <w:pPr>
+        <w:spacing w:after="240" w:before="240" w:line="276" w:lineRule="auto"/>
+        <w:jc w:val="both"/>
+        <w:rPr>
+          <w:highlight w:val="yellow"/>
+        </w:rPr>
+      </w:pPr>
+      <w:r>
+        <w:rPr>
+          <w:highlight w:val="yellow"/>
+          <w:rtl w:val="0"/>
+        </w:rPr>
+        <w:t xml:space="preserve">Account Management Features (CRUD):</w:t>
+      </w:r>
+    </w:p>
+    <w:p>
+      <w:pPr>
+        <w:numPr>
+          <w:ilvl w:val="0"/>
+          <w:numId w:val="8"/>
+        </w:numPr>
+        <w:spacing w:after="0" w:afterAutospacing="0" w:before="240" w:line="276" w:lineRule="auto"/>
+        <w:ind w:left="720" w:hanging="360"/>
+        <w:rPr>
+          <w:highlight w:val="yellow"/>
+        </w:rPr>
+      </w:pPr>
+      <w:r>
+        <w:rPr>
+          <w:highlight w:val="yellow"/>
+          <w:rtl w:val="0"/>
+        </w:rPr>
+        <w:t xml:space="preserve">Create new teacher accounts and assign system access credentials</w:t>
+      </w:r>
+    </w:p>
+    <w:p>
+      <w:pPr>
+        <w:numPr>
+          <w:ilvl w:val="0"/>
+          <w:numId w:val="8"/>
+        </w:numPr>
+        <w:spacing w:after="0" w:afterAutospacing="0" w:before="0" w:beforeAutospacing="0" w:line="276" w:lineRule="auto"/>
+        <w:ind w:left="720" w:hanging="360"/>
+        <w:rPr>
+          <w:highlight w:val="yellow"/>
+        </w:rPr>
+      </w:pPr>
+      <w:r>
+        <w:rPr>
+          <w:highlight w:val="yellow"/>
+          <w:rtl w:val="0"/>
+        </w:rPr>
+        <w:t xml:space="preserve">View and search all registered teacher accounts</w:t>
+      </w:r>
+    </w:p>
+    <w:p>
+      <w:pPr>
+        <w:numPr>
+          <w:ilvl w:val="0"/>
+          <w:numId w:val="8"/>
+        </w:numPr>
+        <w:spacing w:after="0" w:afterAutospacing="0" w:before="0" w:beforeAutospacing="0" w:line="276" w:lineRule="auto"/>
+        <w:ind w:left="720" w:hanging="360"/>
+        <w:rPr>
+          <w:highlight w:val="yellow"/>
+        </w:rPr>
+      </w:pPr>
+      <w:r>
+        <w:rPr>
+          <w:highlight w:val="yellow"/>
+          <w:rtl w:val="0"/>
+        </w:rPr>
+        <w:t xml:space="preserve">Update teacher account details such as name, email, and access credentials</w:t>
+      </w:r>
+    </w:p>
+    <w:p>
+      <w:pPr>
+        <w:numPr>
+          <w:ilvl w:val="0"/>
+          <w:numId w:val="8"/>
+        </w:numPr>
+        <w:spacing w:after="0" w:afterAutospacing="0" w:before="0" w:beforeAutospacing="0" w:line="276" w:lineRule="auto"/>
+        <w:ind w:left="720" w:hanging="360"/>
+        <w:rPr>
+          <w:highlight w:val="yellow"/>
+        </w:rPr>
+      </w:pPr>
+      <w:r>
+        <w:rPr>
+          <w:highlight w:val="yellow"/>
+          <w:rtl w:val="0"/>
+        </w:rPr>
+        <w:t xml:space="preserve">Deactivate or delete teacher accounts when necessary</w:t>
+      </w:r>
+    </w:p>
+    <w:p>
+      <w:pPr>
+        <w:numPr>
+          <w:ilvl w:val="0"/>
+          <w:numId w:val="8"/>
+        </w:numPr>
+        <w:spacing w:after="240" w:before="0" w:beforeAutospacing="0" w:line="276" w:lineRule="auto"/>
+        <w:ind w:left="720" w:hanging="360"/>
+        <w:rPr>
+          <w:highlight w:val="yellow"/>
+        </w:rPr>
+      </w:pPr>
+      <w:r>
+        <w:rPr>
+          <w:highlight w:val="yellow"/>
+          <w:rtl w:val="0"/>
+        </w:rPr>
+        <w:t xml:space="preserve">Reset teacher passwords when requested or required</w:t>
+      </w:r>
+    </w:p>
+    <w:p>
+      <w:pPr>
+        <w:spacing w:after="240" w:before="240" w:line="276" w:lineRule="auto"/>
+        <w:jc w:val="both"/>
         <w:rPr/>
       </w:pPr>
       <w:r>
         <w:rPr>
           <w:rtl w:val="0"/>
         </w:rPr>
-        <w:t xml:space="preserve">Additional exam builder features:</w:t>
-      </w:r>
-    </w:p>
-    <w:p>
-      <w:pPr>
-        <w:numPr>
-          <w:ilvl w:val="0"/>
-          <w:numId w:val="13"/>
-        </w:numPr>
-        <w:spacing w:line="276" w:lineRule="auto"/>
-        <w:ind w:left="720" w:hanging="360"/>
-        <w:jc w:val="both"/>
-      </w:pPr>
-      <w:r>
-        <w:rPr>
-          <w:rtl w:val="0"/>
-        </w:rPr>
-        <w:t xml:space="preserve">Fill-in-the-Blank Question Builder </w:t>
-      </w:r>
-    </w:p>
-    <w:p>
-      <w:pPr>
-        <w:numPr>
-          <w:ilvl w:val="1"/>
-          <w:numId w:val="13"/>
-        </w:numPr>
-        <w:spacing w:line="276" w:lineRule="auto"/>
-        <w:ind w:left="1440" w:hanging="360"/>
-        <w:jc w:val="both"/>
-      </w:pPr>
-      <w:r>
-        <w:rPr>
-          <w:rtl w:val="0"/>
-        </w:rPr>
-        <w:t xml:space="preserve">Create questions with one or more acceptable answers </w:t>
-      </w:r>
-    </w:p>
-    <w:p>
-      <w:pPr>
-        <w:numPr>
-          <w:ilvl w:val="1"/>
-          <w:numId w:val="13"/>
-        </w:numPr>
-        <w:spacing w:line="276" w:lineRule="auto"/>
-        <w:ind w:left="1440" w:hanging="360"/>
-        <w:jc w:val="both"/>
-      </w:pPr>
-      <w:r>
-        <w:rPr>
-          <w:rtl w:val="0"/>
-        </w:rPr>
-        <w:t xml:space="preserve">Configure case sensitivity and answer matching rules </w:t>
-      </w:r>
-    </w:p>
-    <w:p>
-      <w:pPr>
-        <w:numPr>
-          <w:ilvl w:val="1"/>
-          <w:numId w:val="13"/>
-        </w:numPr>
-        <w:spacing w:line="276" w:lineRule="auto"/>
-        <w:ind w:left="1440" w:hanging="360"/>
-        <w:jc w:val="both"/>
-      </w:pPr>
-      <w:r>
-        <w:rPr>
-          <w:rtl w:val="0"/>
-        </w:rPr>
-        <w:t xml:space="preserve">Configure point values for each question </w:t>
-      </w:r>
-    </w:p>
-    <w:p>
-      <w:pPr>
-        <w:numPr>
-          <w:ilvl w:val="0"/>
-          <w:numId w:val="13"/>
-        </w:numPr>
-        <w:spacing w:line="276" w:lineRule="auto"/>
-        <w:ind w:left="720" w:hanging="360"/>
-        <w:jc w:val="both"/>
-        <w:rPr>
-          <w:highlight w:val="yellow"/>
-        </w:rPr>
-      </w:pPr>
-      <w:r>
-        <w:rPr>
-          <w:highlight w:val="yellow"/>
-          <w:rtl w:val="0"/>
-        </w:rPr>
-        <w:t xml:space="preserve">Multiple Choice Question Builder </w:t>
-      </w:r>
-    </w:p>
-    <w:p>
-      <w:pPr>
-        <w:numPr>
-          <w:ilvl w:val="1"/>
-          <w:numId w:val="13"/>
-        </w:numPr>
-        <w:spacing w:line="276" w:lineRule="auto"/>
-        <w:ind w:left="1440" w:hanging="360"/>
-        <w:jc w:val="both"/>
-        <w:rPr>
-          <w:highlight w:val="yellow"/>
-        </w:rPr>
-      </w:pPr>
-      <w:r>
-        <w:rPr>
-          <w:highlight w:val="yellow"/>
-          <w:rtl w:val="0"/>
-        </w:rPr>
-        <w:t xml:space="preserve">Create questions, answer choices, and correct answers </w:t>
-      </w:r>
-    </w:p>
-    <w:p>
-      <w:pPr>
-        <w:numPr>
-          <w:ilvl w:val="1"/>
-          <w:numId w:val="13"/>
-        </w:numPr>
-        <w:spacing w:line="276" w:lineRule="auto"/>
-        <w:ind w:left="1440" w:hanging="360"/>
-        <w:jc w:val="both"/>
-        <w:rPr>
-          <w:highlight w:val="yellow"/>
-        </w:rPr>
-      </w:pPr>
-      <w:r>
-        <w:rPr>
-          <w:highlight w:val="yellow"/>
-          <w:rtl w:val="0"/>
-        </w:rPr>
-        <w:t xml:space="preserve">Configure point values for each question </w:t>
-      </w:r>
-    </w:p>
-    <w:p>
-      <w:pPr>
-        <w:numPr>
-          <w:ilvl w:val="0"/>
-          <w:numId w:val="13"/>
-        </w:numPr>
-        <w:spacing w:line="276" w:lineRule="auto"/>
-        <w:ind w:left="720" w:hanging="360"/>
-        <w:jc w:val="both"/>
-        <w:rPr>
-          <w:highlight w:val="yellow"/>
-        </w:rPr>
-      </w:pPr>
-      <w:r>
-        <w:rPr>
-          <w:highlight w:val="yellow"/>
-          <w:rtl w:val="0"/>
-        </w:rPr>
-        <w:t xml:space="preserve">Coding Question Builder </w:t>
-      </w:r>
-    </w:p>
-    <w:p>
-      <w:pPr>
-        <w:numPr>
-          <w:ilvl w:val="1"/>
-          <w:numId w:val="13"/>
-        </w:numPr>
-        <w:spacing w:line="276" w:lineRule="auto"/>
-        <w:ind w:left="1440" w:hanging="360"/>
-        <w:jc w:val="both"/>
-        <w:rPr>
-          <w:highlight w:val="yellow"/>
-        </w:rPr>
-      </w:pPr>
-      <w:r>
-        <w:rPr>
-          <w:highlight w:val="yellow"/>
-          <w:rtl w:val="0"/>
-        </w:rPr>
-        <w:t xml:space="preserve">Create programming problems with custom problem statements, input specifications, output specifications, and constraints </w:t>
-      </w:r>
-    </w:p>
-    <w:p>
-      <w:pPr>
-        <w:numPr>
-          <w:ilvl w:val="1"/>
-          <w:numId w:val="13"/>
-        </w:numPr>
-        <w:spacing w:line="276" w:lineRule="auto"/>
-        <w:ind w:left="1440" w:hanging="360"/>
-        <w:jc w:val="both"/>
-        <w:rPr>
-          <w:highlight w:val="yellow"/>
-        </w:rPr>
-      </w:pPr>
-      <w:r>
-        <w:rPr>
-          <w:highlight w:val="yellow"/>
-          <w:rtl w:val="0"/>
-        </w:rPr>
-        <w:t xml:space="preserve">Define visible sample test cases for student practice </w:t>
-      </w:r>
-    </w:p>
-    <w:p>
-      <w:pPr>
-        <w:numPr>
-          <w:ilvl w:val="1"/>
-          <w:numId w:val="13"/>
-        </w:numPr>
-        <w:spacing w:line="276" w:lineRule="auto"/>
-        <w:ind w:left="1440" w:hanging="360"/>
-        <w:jc w:val="both"/>
-        <w:rPr>
-          <w:highlight w:val="yellow"/>
-        </w:rPr>
-      </w:pPr>
-      <w:r>
-        <w:rPr>
-          <w:highlight w:val="yellow"/>
-          <w:rtl w:val="0"/>
-        </w:rPr>
-        <w:t xml:space="preserve">Define hidden test cases used for automated grading</w:t>
-      </w:r>
-    </w:p>
-    <w:p>
-      <w:pPr>
-        <w:numPr>
-          <w:ilvl w:val="1"/>
-          <w:numId w:val="13"/>
-        </w:numPr>
-        <w:spacing w:line="276" w:lineRule="auto"/>
-        <w:ind w:left="1440" w:hanging="360"/>
-        <w:jc w:val="both"/>
-        <w:rPr>
-          <w:highlight w:val="yellow"/>
-        </w:rPr>
-      </w:pPr>
-      <w:r>
-        <w:rPr>
-          <w:highlight w:val="yellow"/>
-          <w:rtl w:val="0"/>
-        </w:rPr>
-        <w:t xml:space="preserve">Specify expected outputs for each test case </w:t>
-      </w:r>
-    </w:p>
-    <w:p>
-      <w:pPr>
-        <w:numPr>
-          <w:ilvl w:val="1"/>
-          <w:numId w:val="13"/>
-        </w:numPr>
-        <w:spacing w:line="276" w:lineRule="auto"/>
-        <w:ind w:left="1440" w:hanging="360"/>
-        <w:jc w:val="both"/>
-        <w:rPr>
-          <w:highlight w:val="yellow"/>
-        </w:rPr>
-      </w:pPr>
-      <w:r>
-        <w:rPr>
-          <w:highlight w:val="yellow"/>
-          <w:rtl w:val="0"/>
-        </w:rPr>
-        <w:t xml:space="preserve">Configure time limits and scoring criteria for submissions </w:t>
-      </w:r>
-    </w:p>
-    <w:p>
-      <w:pPr>
-        <w:numPr>
-          <w:ilvl w:val="1"/>
-          <w:numId w:val="13"/>
-        </w:numPr>
-        <w:spacing w:line="276" w:lineRule="auto"/>
-        <w:ind w:left="1440" w:hanging="360"/>
-        <w:jc w:val="both"/>
-        <w:rPr>
-          <w:highlight w:val="yellow"/>
-        </w:rPr>
-      </w:pPr>
-      <w:r>
-        <w:rPr>
-          <w:highlight w:val="yellow"/>
-          <w:rtl w:val="0"/>
-        </w:rPr>
-        <w:t xml:space="preserve">Teachers can give out “check” penalties.</w:t>
-      </w:r>
-    </w:p>
-    <w:p>
-      <w:pPr>
-        <w:numPr>
-          <w:ilvl w:val="1"/>
-          <w:numId w:val="13"/>
-        </w:numPr>
-        <w:spacing w:line="276" w:lineRule="auto"/>
-        <w:ind w:left="1440" w:hanging="360"/>
-        <w:jc w:val="both"/>
-        <w:rPr>
-          <w:highlight w:val="yellow"/>
-        </w:rPr>
-      </w:pPr>
-      <w:r>
-        <w:rPr>
-          <w:highlight w:val="yellow"/>
-          <w:rtl w:val="0"/>
-        </w:rPr>
-        <w:t xml:space="preserve">Preview and validate test cases before publishing the exam </w:t>
-      </w:r>
-    </w:p>
-    <w:p>
-      <w:pPr>
-        <w:numPr>
-          <w:ilvl w:val="0"/>
-          <w:numId w:val="13"/>
-        </w:numPr>
-        <w:spacing w:before="240" w:line="276" w:lineRule="auto"/>
-        <w:ind w:left="720" w:hanging="360"/>
-        <w:jc w:val="both"/>
-        <w:rPr>
-          <w:highlight w:val="yellow"/>
-        </w:rPr>
-      </w:pPr>
-      <w:r>
-        <w:rPr>
-          <w:highlight w:val="yellow"/>
-          <w:rtl w:val="0"/>
-        </w:rPr>
-        <w:t xml:space="preserve">Hidden test cases are used exclusively for automated grading and are never visible to students during the examination. </w:t>
-      </w:r>
-    </w:p>
-    <w:p>
-      <w:pPr>
-        <w:numPr>
-          <w:ilvl w:val="0"/>
-          <w:numId w:val="13"/>
-        </w:numPr>
-        <w:spacing w:line="276" w:lineRule="auto"/>
-        <w:ind w:left="720" w:hanging="360"/>
-        <w:jc w:val="both"/>
-        <w:rPr>
-          <w:highlight w:val="yellow"/>
-        </w:rPr>
-      </w:pPr>
-      <w:r>
-        <w:rPr>
-          <w:highlight w:val="yellow"/>
-          <w:rtl w:val="0"/>
-        </w:rPr>
-        <w:t xml:space="preserve">Question order can be randomized per student to reduce answer sharing.</w:t>
-      </w:r>
-    </w:p>
-    <w:p>
-      <w:pPr>
-        <w:numPr>
-          <w:ilvl w:val="0"/>
-          <w:numId w:val="13"/>
-        </w:numPr>
-        <w:spacing w:after="240" w:line="276" w:lineRule="auto"/>
-        <w:ind w:left="720" w:hanging="360"/>
-        <w:jc w:val="both"/>
-      </w:pPr>
-      <w:r>
-        <w:rPr>
-          <w:rtl w:val="0"/>
-        </w:rPr>
-        <w:t xml:space="preserve">The teacher portal is web-based and accessible through the cloud-based platform from any authorized device.</w:t>
-      </w:r>
-    </w:p>
-    <w:p>
-      <w:pPr>
-        <w:numPr>
-          <w:ilvl w:val="0"/>
-          <w:numId w:val="13"/>
-        </w:numPr>
-        <w:spacing w:after="240" w:line="276" w:lineRule="auto"/>
-        <w:ind w:left="720" w:hanging="360"/>
-        <w:jc w:val="both"/>
-      </w:pPr>
-      <w:r>
-        <w:rPr>
-          <w:rtl w:val="0"/>
-        </w:rPr>
-        <w:t xml:space="preserve">Teacher can update scores</w:t>
-      </w:r>
-    </w:p>
-    <w:p>
-      <w:pPr>
-        <w:spacing w:after="240" w:before="240" w:line="276" w:lineRule="auto"/>
-        <w:jc w:val="both"/>
-        <w:rPr>
-          <w:b w:val="1"/>
-          <w:bCs w:val="1"/>
-        </w:rPr>
-      </w:pPr>
-      <w:r>
-        <w:rPr>
-          <w:b w:val="1"/>
-          <w:bCs w:val="1"/>
-          <w:rtl w:val="0"/>
-        </w:rPr>
-        <w:t xml:space="preserve">3. </w:t>
-      </w:r>
-      <w:r>
-        <w:rPr>
-          <w:b w:val="1"/>
-          <w:bCs w:val="1"/>
-          <w:highlight w:val="yellow"/>
-          <w:rtl w:val="0"/>
-        </w:rPr>
-        <w:t xml:space="preserve">Result and Incident Report Export</w:t>
-      </w:r>
-      <w:r>
-        <w:rPr>
-          <w:rtl w:val="0"/>
-        </w:rPr>
-      </w:r>
-    </w:p>
-    <w:p>
-      <w:pPr>
-        <w:numPr>
-          <w:ilvl w:val="0"/>
-          <w:numId w:val="1"/>
-        </w:numPr>
-        <w:spacing w:before="240" w:line="276" w:lineRule="auto"/>
-        <w:ind w:left="720" w:hanging="360"/>
-        <w:jc w:val="both"/>
-        <w:rPr>
-          <w:highlight w:val="yellow"/>
-        </w:rPr>
-      </w:pPr>
-      <w:r>
-        <w:rPr>
-          <w:highlight w:val="yellow"/>
-          <w:rtl w:val="0"/>
-        </w:rPr>
-        <w:t xml:space="preserve">After the exam, the teacher can export a full results sheet as a CSV file.</w:t>
-      </w:r>
-    </w:p>
-    <w:p>
-      <w:pPr>
-        <w:numPr>
-          <w:ilvl w:val="0"/>
-          <w:numId w:val="1"/>
-        </w:numPr>
-        <w:spacing w:line="276" w:lineRule="auto"/>
-        <w:ind w:left="720" w:hanging="360"/>
-        <w:jc w:val="both"/>
-        <w:rPr>
-          <w:highlight w:val="yellow"/>
-        </w:rPr>
-      </w:pPr>
-      <w:r>
-        <w:rPr>
-          <w:highlight w:val="yellow"/>
-          <w:rtl w:val="0"/>
-        </w:rPr>
-        <w:t xml:space="preserve">Results include per-student scores broken down by question.</w:t>
-      </w:r>
-    </w:p>
-    <w:p>
-      <w:pPr>
-        <w:numPr>
-          <w:ilvl w:val="0"/>
-          <w:numId w:val="1"/>
-        </w:numPr>
-        <w:spacing w:line="276" w:lineRule="auto"/>
-        <w:ind w:left="720" w:hanging="360"/>
-        <w:jc w:val="both"/>
-      </w:pPr>
-      <w:r>
-        <w:rPr>
-          <w:rtl w:val="0"/>
-        </w:rPr>
-        <w:t xml:space="preserve">The incident report lists all logged violations with timestamps.</w:t>
-      </w:r>
-    </w:p>
-    <w:p>
-      <w:pPr>
-        <w:numPr>
-          <w:ilvl w:val="0"/>
-          <w:numId w:val="1"/>
-        </w:numPr>
-        <w:spacing w:after="240" w:line="276" w:lineRule="auto"/>
-        <w:ind w:left="720" w:hanging="360"/>
-        <w:jc w:val="both"/>
-      </w:pPr>
-      <w:r>
-        <w:rPr>
-          <w:rtl w:val="0"/>
-        </w:rPr>
-        <w:t xml:space="preserve">Exports are generated immediately after the exam ends with no additional configuration.</w:t>
-      </w:r>
-    </w:p>
-    <w:p>
-      <w:pPr>
-        <w:spacing w:after="240" w:before="240" w:line="276" w:lineRule="auto"/>
-        <w:jc w:val="both"/>
-        <w:rPr>
-          <w:b w:val="1"/>
-          <w:bCs w:val="1"/>
-          <w:highlight w:val="yellow"/>
-        </w:rPr>
-      </w:pPr>
-      <w:r>
-        <w:rPr>
-          <w:b w:val="1"/>
-          <w:bCs w:val="1"/>
-          <w:highlight w:val="yellow"/>
-          <w:rtl w:val="0"/>
-        </w:rPr>
-        <w:t xml:space="preserve">4. Cloud-Based Synchronization </w:t>
-      </w:r>
-    </w:p>
-    <w:p>
-      <w:pPr>
-        <w:numPr>
-          <w:ilvl w:val="0"/>
-          <w:numId w:val="4"/>
-        </w:numPr>
-        <w:spacing w:line="276" w:lineRule="auto"/>
-        <w:ind w:left="720" w:hanging="360"/>
-        <w:jc w:val="both"/>
-        <w:rPr>
-          <w:highlight w:val="yellow"/>
-        </w:rPr>
-      </w:pPr>
-      <w:r>
-        <w:rPr>
-          <w:highlight w:val="yellow"/>
-          <w:rtl w:val="0"/>
-        </w:rPr>
-        <w:t xml:space="preserve">Exam delivery, </w:t>
-      </w:r>
-    </w:p>
-    <w:p>
-      <w:pPr>
-        <w:numPr>
-          <w:ilvl w:val="0"/>
-          <w:numId w:val="4"/>
-        </w:numPr>
-        <w:spacing w:line="276" w:lineRule="auto"/>
-        <w:ind w:left="720" w:hanging="360"/>
-        <w:jc w:val="both"/>
-        <w:rPr>
-          <w:highlight w:val="yellow"/>
-        </w:rPr>
-      </w:pPr>
-      <w:r>
-        <w:rPr>
-          <w:highlight w:val="yellow"/>
-          <w:rtl w:val="0"/>
-        </w:rPr>
-        <w:t xml:space="preserve">Student progress updates</w:t>
-      </w:r>
-    </w:p>
-    <w:p>
-      <w:pPr>
-        <w:numPr>
-          <w:ilvl w:val="0"/>
-          <w:numId w:val="4"/>
-        </w:numPr>
-        <w:spacing w:line="276" w:lineRule="auto"/>
-        <w:ind w:left="720" w:hanging="360"/>
-        <w:jc w:val="both"/>
-      </w:pPr>
-      <w:r>
-        <w:rPr>
-          <w:rtl w:val="0"/>
-        </w:rPr>
-        <w:t xml:space="preserve">V</w:t>
-      </w:r>
-      <w:r>
-        <w:rPr>
-          <w:rtl w:val="0"/>
-        </w:rPr>
-        <w:t xml:space="preserve">iolation alerts</w:t>
-      </w:r>
-    </w:p>
-    <w:p>
-      <w:pPr>
-        <w:numPr>
-          <w:ilvl w:val="0"/>
-          <w:numId w:val="4"/>
-        </w:numPr>
-        <w:spacing w:line="276" w:lineRule="auto"/>
-        <w:ind w:left="720" w:hanging="360"/>
-        <w:jc w:val="both"/>
-        <w:rPr>
-          <w:highlight w:val="yellow"/>
-        </w:rPr>
-      </w:pPr>
-      <w:r>
-        <w:rPr>
-          <w:highlight w:val="yellow"/>
-          <w:rtl w:val="0"/>
-        </w:rPr>
-        <w:t xml:space="preserve">Submission results.</w:t>
-      </w:r>
-    </w:p>
-    <w:p>
-      <w:pPr>
-        <w:numPr>
-          <w:ilvl w:val="0"/>
-          <w:numId w:val="4"/>
-        </w:numPr>
-        <w:spacing w:line="276" w:lineRule="auto"/>
-        <w:ind w:left="720" w:hanging="360"/>
-        <w:jc w:val="both"/>
-        <w:rPr>
-          <w:highlight w:val="yellow"/>
-        </w:rPr>
-      </w:pPr>
-      <w:r>
-        <w:rPr>
-          <w:highlight w:val="yellow"/>
-          <w:rtl w:val="0"/>
-        </w:rPr>
-        <w:t xml:space="preserve">Teachers receive live updates through the monitoring dashboard regardless of device location. </w:t>
-      </w:r>
-    </w:p>
-    <w:p>
-      <w:pPr>
-        <w:spacing w:after="240" w:before="240" w:line="276" w:lineRule="auto"/>
-        <w:jc w:val="both"/>
-        <w:rPr>
-          <w:b w:val="1"/>
-          <w:bCs w:val="1"/>
-          <w:highlight w:val="yellow"/>
-        </w:rPr>
-      </w:pPr>
-      <w:r>
-        <w:rPr>
-          <w:b w:val="1"/>
-          <w:bCs w:val="1"/>
-          <w:highlight w:val="yellow"/>
-          <w:rtl w:val="0"/>
-        </w:rPr>
-        <w:t xml:space="preserve">5. Admin Dashboard </w:t>
-      </w:r>
-    </w:p>
-    <w:p>
-      <w:pPr>
-        <w:spacing w:after="240" w:before="240" w:line="276" w:lineRule="auto"/>
-        <w:jc w:val="both"/>
-        <w:rPr>
-          <w:highlight w:val="yellow"/>
-        </w:rPr>
-      </w:pPr>
-      <w:r>
-        <w:rPr>
-          <w:highlight w:val="yellow"/>
-          <w:rtl w:val="0"/>
-        </w:rPr>
-        <w:t xml:space="preserve">The admin dashboard provides centralized administrative control over teacher accounts and system access management through the web-based platform.</w:t>
-      </w:r>
-    </w:p>
-    <w:p>
-      <w:pPr>
-        <w:spacing w:after="240" w:before="240" w:line="276" w:lineRule="auto"/>
-        <w:jc w:val="both"/>
-        <w:rPr>
-          <w:highlight w:val="yellow"/>
-        </w:rPr>
-      </w:pPr>
-      <w:r>
-        <w:rPr>
-          <w:highlight w:val="yellow"/>
-          <w:rtl w:val="0"/>
-        </w:rPr>
-        <w:t xml:space="preserve">Account Management Features (CRUD):</w:t>
-      </w:r>
-    </w:p>
-    <w:p>
-      <w:pPr>
-        <w:numPr>
-          <w:ilvl w:val="0"/>
-          <w:numId w:val="7"/>
+        <w:t xml:space="preserve">Audit Logging Features:</w:t>
+      </w:r>
+    </w:p>
+    <w:p>
+      <w:pPr>
+        <w:numPr>
+          <w:ilvl w:val="0"/>
+          <w:numId w:val="9"/>
         </w:numPr>
         <w:spacing w:after="0" w:afterAutospacing="0" w:before="240" w:line="276" w:lineRule="auto"/>
         <w:ind w:left="720" w:hanging="360"/>
@@ -2228,146 +2346,33 @@
           <w:highlight w:val="yellow"/>
           <w:rtl w:val="0"/>
         </w:rPr>
-        <w:t xml:space="preserve">Create new teacher accounts and assign system access credentials</w:t>
-      </w:r>
-    </w:p>
-    <w:p>
-      <w:pPr>
-        <w:numPr>
-          <w:ilvl w:val="0"/>
-          <w:numId w:val="7"/>
+        <w:t xml:space="preserve">All administrative actions are automatically recorded in an audit log</w:t>
+      </w:r>
+    </w:p>
+    <w:p>
+      <w:pPr>
+        <w:numPr>
+          <w:ilvl w:val="0"/>
+          <w:numId w:val="9"/>
         </w:numPr>
         <w:spacing w:after="0" w:afterAutospacing="0" w:before="0" w:beforeAutospacing="0" w:line="276" w:lineRule="auto"/>
         <w:ind w:left="720" w:hanging="360"/>
-        <w:rPr>
-          <w:highlight w:val="yellow"/>
-        </w:rPr>
-      </w:pPr>
-      <w:r>
-        <w:rPr>
-          <w:highlight w:val="yellow"/>
-          <w:rtl w:val="0"/>
-        </w:rPr>
-        <w:t xml:space="preserve">View and search all registered teacher accounts</w:t>
-      </w:r>
-    </w:p>
-    <w:p>
-      <w:pPr>
-        <w:numPr>
-          <w:ilvl w:val="0"/>
-          <w:numId w:val="7"/>
+      </w:pPr>
+      <w:r>
+        <w:rPr>
+          <w:rtl w:val="0"/>
+        </w:rPr>
+        <w:t xml:space="preserve">Logs include account creation, updates, deletions, password resets, and access changes</w:t>
+      </w:r>
+    </w:p>
+    <w:p>
+      <w:pPr>
+        <w:numPr>
+          <w:ilvl w:val="0"/>
+          <w:numId w:val="9"/>
         </w:numPr>
         <w:spacing w:after="0" w:afterAutospacing="0" w:before="0" w:beforeAutospacing="0" w:line="276" w:lineRule="auto"/>
         <w:ind w:left="720" w:hanging="360"/>
-        <w:rPr>
-          <w:highlight w:val="yellow"/>
-        </w:rPr>
-      </w:pPr>
-      <w:r>
-        <w:rPr>
-          <w:highlight w:val="yellow"/>
-          <w:rtl w:val="0"/>
-        </w:rPr>
-        <w:t xml:space="preserve">Update teacher account details such as name, email, and access credentials</w:t>
-      </w:r>
-    </w:p>
-    <w:p>
-      <w:pPr>
-        <w:numPr>
-          <w:ilvl w:val="0"/>
-          <w:numId w:val="7"/>
-        </w:numPr>
-        <w:spacing w:after="0" w:afterAutospacing="0" w:before="0" w:beforeAutospacing="0" w:line="276" w:lineRule="auto"/>
-        <w:ind w:left="720" w:hanging="360"/>
-        <w:rPr>
-          <w:highlight w:val="yellow"/>
-        </w:rPr>
-      </w:pPr>
-      <w:r>
-        <w:rPr>
-          <w:highlight w:val="yellow"/>
-          <w:rtl w:val="0"/>
-        </w:rPr>
-        <w:t xml:space="preserve">Deactivate or delete teacher accounts when necessary</w:t>
-      </w:r>
-    </w:p>
-    <w:p>
-      <w:pPr>
-        <w:numPr>
-          <w:ilvl w:val="0"/>
-          <w:numId w:val="7"/>
-        </w:numPr>
-        <w:spacing w:after="240" w:before="0" w:beforeAutospacing="0" w:line="276" w:lineRule="auto"/>
-        <w:ind w:left="720" w:hanging="360"/>
-        <w:rPr>
-          <w:highlight w:val="yellow"/>
-        </w:rPr>
-      </w:pPr>
-      <w:r>
-        <w:rPr>
-          <w:highlight w:val="yellow"/>
-          <w:rtl w:val="0"/>
-        </w:rPr>
-        <w:t xml:space="preserve">Reset teacher passwords when requested or required</w:t>
-      </w:r>
-    </w:p>
-    <w:p>
-      <w:pPr>
-        <w:spacing w:after="240" w:before="240" w:line="276" w:lineRule="auto"/>
-        <w:jc w:val="both"/>
-        <w:rPr/>
-      </w:pPr>
-      <w:r>
-        <w:rPr>
-          <w:rtl w:val="0"/>
-        </w:rPr>
-        <w:t xml:space="preserve">Audit Logging Features:</w:t>
-      </w:r>
-    </w:p>
-    <w:p>
-      <w:pPr>
-        <w:numPr>
-          <w:ilvl w:val="0"/>
-          <w:numId w:val="8"/>
-        </w:numPr>
-        <w:spacing w:after="0" w:afterAutospacing="0" w:before="240" w:line="276" w:lineRule="auto"/>
-        <w:ind w:left="720" w:hanging="360"/>
-        <w:rPr>
-          <w:highlight w:val="yellow"/>
-        </w:rPr>
-      </w:pPr>
-      <w:r>
-        <w:rPr>
-          <w:highlight w:val="yellow"/>
-          <w:rtl w:val="0"/>
-        </w:rPr>
-        <w:t xml:space="preserve">All administrative actions are automatically recorded in an audit log</w:t>
-      </w:r>
-    </w:p>
-    <w:p>
-      <w:pPr>
-        <w:numPr>
-          <w:ilvl w:val="0"/>
-          <w:numId w:val="8"/>
-        </w:numPr>
-        <w:spacing w:after="0" w:afterAutospacing="0" w:before="0" w:beforeAutospacing="0" w:line="276" w:lineRule="auto"/>
-        <w:ind w:left="720" w:hanging="360"/>
-      </w:pPr>
-      <w:r>
-        <w:rPr>
-          <w:rtl w:val="0"/>
-        </w:rPr>
-        <w:t xml:space="preserve">Logs include account creation, updates, deletions, password resets, and access changes</w:t>
-      </w:r>
-    </w:p>
-    <w:p>
-      <w:pPr>
-        <w:numPr>
-          <w:ilvl w:val="0"/>
-          <w:numId w:val="8"/>
-        </w:numPr>
-        <w:spacing w:after="0" w:afterAutospacing="0" w:before="0" w:beforeAutospacing="0" w:line="276" w:lineRule="auto"/>
-        <w:ind w:left="720" w:hanging="360"/>
       </w:pPr>
       <w:r>
         <w:rPr>
@@ -2380,7 +2385,7 @@
       <w:pPr>
         <w:numPr>
           <w:ilvl w:val="0"/>
-          <w:numId w:val="8"/>
+          <w:numId w:val="9"/>
         </w:numPr>
         <w:spacing w:after="240" w:before="0" w:beforeAutospacing="0" w:line="276" w:lineRule="auto"/>
         <w:ind w:left="720" w:hanging="360"/>
@@ -2485,7 +2490,7 @@
       <w:pPr>
         <w:numPr>
           <w:ilvl w:val="0"/>
-          <w:numId w:val="4"/>
+          <w:numId w:val="5"/>
         </w:numPr>
         <w:spacing w:line="276" w:lineRule="auto"/>
         <w:ind w:left="720" w:hanging="360"/>
@@ -2502,7 +2507,7 @@
       <w:pPr>
         <w:numPr>
           <w:ilvl w:val="0"/>
-          <w:numId w:val="4"/>
+          <w:numId w:val="5"/>
         </w:numPr>
         <w:spacing w:line="276" w:lineRule="auto"/>
         <w:ind w:left="720" w:hanging="360"/>
@@ -2537,7 +2542,7 @@
       <w:pPr>
         <w:numPr>
           <w:ilvl w:val="0"/>
-          <w:numId w:val="4"/>
+          <w:numId w:val="5"/>
         </w:numPr>
         <w:spacing w:line="276" w:lineRule="auto"/>
         <w:ind w:left="720" w:hanging="360"/>
@@ -2554,7 +2559,7 @@
       <w:pPr>
         <w:numPr>
           <w:ilvl w:val="0"/>
-          <w:numId w:val="4"/>
+          <w:numId w:val="5"/>
         </w:numPr>
         <w:spacing w:line="276" w:lineRule="auto"/>
         <w:ind w:left="720" w:hanging="360"/>
@@ -2565,6 +2570,272 @@
           <w:rtl w:val="0"/>
         </w:rPr>
         <w:t xml:space="preserve">This includes applications attempting to conceal themselves from normal process lists or imitate legitimate system processes.</w:t>
+      </w:r>
+    </w:p>
+    <w:p>
+      <w:pPr>
+        <w:spacing w:line="276" w:lineRule="auto"/>
+        <w:rPr>
+          <w:b w:val="1"/>
+          <w:bCs w:val="1"/>
+        </w:rPr>
+      </w:pPr>
+      <w:r>
+        <w:rPr>
+          <w:rtl w:val="0"/>
+        </w:rPr>
+      </w:r>
+    </w:p>
+    <w:p>
+      <w:pPr>
+        <w:spacing w:line="276" w:lineRule="auto"/>
+        <w:rPr>
+          <w:b w:val="1"/>
+          <w:bCs w:val="1"/>
+        </w:rPr>
+      </w:pPr>
+      <w:r>
+        <w:rPr>
+          <w:rtl w:val="0"/>
+        </w:rPr>
+      </w:r>
+    </w:p>
+    <w:p>
+      <w:pPr>
+        <w:spacing w:line="276" w:lineRule="auto"/>
+        <w:rPr>
+          <w:b w:val="1"/>
+          <w:bCs w:val="1"/>
+        </w:rPr>
+      </w:pPr>
+      <w:r>
+        <w:rPr>
+          <w:rtl w:val="0"/>
+        </w:rPr>
+      </w:r>
+    </w:p>
+    <w:p>
+      <w:pPr>
+        <w:spacing w:line="276" w:lineRule="auto"/>
+        <w:rPr>
+          <w:b w:val="1"/>
+          <w:bCs w:val="1"/>
+        </w:rPr>
+      </w:pPr>
+      <w:r>
+        <w:rPr>
+          <w:rtl w:val="0"/>
+        </w:rPr>
+      </w:r>
+    </w:p>
+    <w:p>
+      <w:pPr>
+        <w:spacing w:line="276" w:lineRule="auto"/>
+        <w:rPr>
+          <w:b w:val="1"/>
+          <w:bCs w:val="1"/>
+        </w:rPr>
+      </w:pPr>
+      <w:r>
+        <w:rPr>
+          <w:rtl w:val="0"/>
+        </w:rPr>
+      </w:r>
+    </w:p>
+    <w:p>
+      <w:pPr>
+        <w:spacing w:line="276" w:lineRule="auto"/>
+        <w:rPr>
+          <w:b w:val="1"/>
+          <w:bCs w:val="1"/>
+        </w:rPr>
+      </w:pPr>
+      <w:r>
+        <w:rPr>
+          <w:rtl w:val="0"/>
+        </w:rPr>
+      </w:r>
+    </w:p>
+    <w:p>
+      <w:pPr>
+        <w:spacing w:line="276" w:lineRule="auto"/>
+        <w:rPr>
+          <w:b w:val="1"/>
+          <w:bCs w:val="1"/>
+        </w:rPr>
+      </w:pPr>
+      <w:r>
+        <w:rPr>
+          <w:rtl w:val="0"/>
+        </w:rPr>
+      </w:r>
+    </w:p>
+    <w:p>
+      <w:pPr>
+        <w:spacing w:line="276" w:lineRule="auto"/>
+        <w:rPr>
+          <w:b w:val="1"/>
+          <w:bCs w:val="1"/>
+        </w:rPr>
+      </w:pPr>
+      <w:r>
+        <w:rPr>
+          <w:rtl w:val="0"/>
+        </w:rPr>
+      </w:r>
+    </w:p>
+    <w:p>
+      <w:pPr>
+        <w:spacing w:line="276" w:lineRule="auto"/>
+        <w:rPr>
+          <w:b w:val="1"/>
+          <w:bCs w:val="1"/>
+        </w:rPr>
+      </w:pPr>
+      <w:r>
+        <w:rPr>
+          <w:rtl w:val="0"/>
+        </w:rPr>
+      </w:r>
+    </w:p>
+    <w:p>
+      <w:pPr>
+        <w:spacing w:line="276" w:lineRule="auto"/>
+        <w:rPr>
+          <w:b w:val="1"/>
+          <w:bCs w:val="1"/>
+        </w:rPr>
+      </w:pPr>
+      <w:r>
+        <w:rPr>
+          <w:rtl w:val="0"/>
+        </w:rPr>
+      </w:r>
+    </w:p>
+    <w:p>
+      <w:pPr>
+        <w:spacing w:line="276" w:lineRule="auto"/>
+        <w:rPr>
+          <w:b w:val="1"/>
+          <w:bCs w:val="1"/>
+        </w:rPr>
+      </w:pPr>
+      <w:r>
+        <w:rPr>
+          <w:rtl w:val="0"/>
+        </w:rPr>
+      </w:r>
+    </w:p>
+    <w:p>
+      <w:pPr>
+        <w:spacing w:line="276" w:lineRule="auto"/>
+        <w:rPr>
+          <w:b w:val="1"/>
+          <w:bCs w:val="1"/>
+        </w:rPr>
+      </w:pPr>
+      <w:r>
+        <w:rPr>
+          <w:rtl w:val="0"/>
+        </w:rPr>
+      </w:r>
+    </w:p>
+    <w:p>
+      <w:pPr>
+        <w:spacing w:line="276" w:lineRule="auto"/>
+        <w:rPr>
+          <w:b w:val="1"/>
+          <w:bCs w:val="1"/>
+        </w:rPr>
+      </w:pPr>
+      <w:r>
+        <w:rPr>
+          <w:rtl w:val="0"/>
+        </w:rPr>
+      </w:r>
+    </w:p>
+    <w:p>
+      <w:pPr>
+        <w:spacing w:line="276" w:lineRule="auto"/>
+        <w:rPr>
+          <w:b w:val="1"/>
+          <w:bCs w:val="1"/>
+        </w:rPr>
+      </w:pPr>
+      <w:r>
+        <w:rPr>
+          <w:rtl w:val="0"/>
+        </w:rPr>
+      </w:r>
+    </w:p>
+    <w:p>
+      <w:pPr>
+        <w:spacing w:line="276" w:lineRule="auto"/>
+        <w:rPr>
+          <w:b w:val="1"/>
+          <w:bCs w:val="1"/>
+        </w:rPr>
+      </w:pPr>
+      <w:r>
+        <w:rPr>
+          <w:rtl w:val="0"/>
+        </w:rPr>
+      </w:r>
+    </w:p>
+    <w:p>
+      <w:pPr>
+        <w:spacing w:line="276" w:lineRule="auto"/>
+        <w:rPr>
+          <w:b w:val="1"/>
+          <w:bCs w:val="1"/>
+        </w:rPr>
+      </w:pPr>
+      <w:r>
+        <w:rPr>
+          <w:rtl w:val="0"/>
+        </w:rPr>
+      </w:r>
+    </w:p>
+    <w:p>
+      <w:pPr>
+        <w:spacing w:line="276" w:lineRule="auto"/>
+        <w:rPr>
+          <w:b w:val="1"/>
+          <w:bCs w:val="1"/>
+        </w:rPr>
+      </w:pPr>
+      <w:r>
+        <w:rPr>
+          <w:rtl w:val="0"/>
+        </w:rPr>
+      </w:r>
+    </w:p>
+    <w:p>
+      <w:pPr>
+        <w:spacing w:line="276" w:lineRule="auto"/>
+        <w:rPr>
+          <w:b w:val="1"/>
+          <w:bCs w:val="1"/>
+        </w:rPr>
+      </w:pPr>
+      <w:r>
+        <w:rPr>
+          <w:rtl w:val="0"/>
+        </w:rPr>
+      </w:r>
+    </w:p>
+    <w:p>
+      <w:pPr>
+        <w:spacing w:line="276" w:lineRule="auto"/>
+        <w:rPr>
+          <w:b w:val="1"/>
+          <w:bCs w:val="1"/>
+        </w:rPr>
+      </w:pPr>
+      <w:r>
+        <w:rPr>
+          <w:rtl w:val="0"/>
+        </w:rPr>
       </w:r>
     </w:p>
     <w:p>
@@ -2730,18 +3001,157 @@
       <w:pPr>
         <w:numPr>
           <w:ilvl w:val="0"/>
+          <w:numId w:val="5"/>
+        </w:numPr>
+        <w:spacing w:line="276" w:lineRule="auto"/>
+        <w:ind w:left="720" w:hanging="360"/>
+        <w:jc w:val="both"/>
+        <w:rPr/>
+      </w:pPr>
+      <w:r>
+        <w:rPr>
+          <w:rtl w:val="0"/>
+        </w:rPr>
+        <w:t xml:space="preserve">The system can disable or restrict selected external ports (such as USB storage devices) during an active examination to prevent file-based cheating or unauthorized material access.</w:t>
+      </w:r>
+    </w:p>
+    <w:p>
+      <w:pPr>
+        <w:numPr>
+          <w:ilvl w:val="0"/>
+          <w:numId w:val="5"/>
+        </w:numPr>
+        <w:spacing w:line="276" w:lineRule="auto"/>
+        <w:ind w:left="720" w:hanging="360"/>
+        <w:jc w:val="both"/>
+        <w:rPr/>
+      </w:pPr>
+      <w:r>
+        <w:rPr>
+          <w:rtl w:val="0"/>
+        </w:rPr>
+        <w:t xml:space="preserve">Port access is restored automatically when the examination session ends.</w:t>
+      </w:r>
+    </w:p>
+    <w:p>
+      <w:pPr>
+        <w:spacing w:after="240" w:before="240" w:line="276" w:lineRule="auto"/>
+        <w:jc w:val="both"/>
+        <w:rPr>
+          <w:b w:val="1"/>
+          <w:bCs w:val="1"/>
+        </w:rPr>
+      </w:pPr>
+      <w:r>
+        <w:rPr>
+          <w:b w:val="1"/>
+          <w:bCs w:val="1"/>
+          <w:rtl w:val="0"/>
+        </w:rPr>
+        <w:t xml:space="preserve">2. Hidden Process Detection  </w:t>
+      </w:r>
+    </w:p>
+    <w:p>
+      <w:pPr>
+        <w:numPr>
+          <w:ilvl w:val="0"/>
+          <w:numId w:val="5"/>
+        </w:numPr>
+        <w:spacing w:line="276" w:lineRule="auto"/>
+        <w:ind w:left="720" w:hanging="360"/>
+        <w:jc w:val="both"/>
+        <w:rPr/>
+      </w:pPr>
+      <w:r>
+        <w:rPr>
+          <w:rtl w:val="0"/>
+        </w:rPr>
+        <w:t xml:space="preserve">The system can detect and flag suspicious hidden background applications or disguised processes running during an examination.</w:t>
+      </w:r>
+    </w:p>
+    <w:p>
+      <w:pPr>
+        <w:numPr>
+          <w:ilvl w:val="0"/>
+          <w:numId w:val="5"/>
+        </w:numPr>
+        <w:spacing w:line="276" w:lineRule="auto"/>
+        <w:ind w:left="720" w:hanging="360"/>
+        <w:jc w:val="both"/>
+        <w:rPr/>
+      </w:pPr>
+      <w:r>
+        <w:rPr>
+          <w:rtl w:val="0"/>
+        </w:rPr>
+        <w:t xml:space="preserve">This includes applications attempting to conceal themselves from normal process lists or imitate legitimate system processes.</w:t>
+      </w:r>
+    </w:p>
+    <w:p>
+      <w:pPr>
+        <w:spacing w:line="276" w:lineRule="auto"/>
+        <w:jc w:val="both"/>
+        <w:rPr/>
+      </w:pPr>
+      <w:r>
+        <w:rPr>
+          <w:rtl w:val="0"/>
+        </w:rPr>
+      </w:r>
+    </w:p>
+    <w:p>
+      <w:pPr>
+        <w:spacing w:line="276" w:lineRule="auto"/>
+        <w:rPr>
+          <w:b w:val="1"/>
+          <w:bCs w:val="1"/>
+          <w:highlight w:val="yellow"/>
+        </w:rPr>
+      </w:pPr>
+      <w:r>
+        <w:rPr>
+          <w:b w:val="1"/>
+          <w:bCs w:val="1"/>
+          <w:highlight w:val="yellow"/>
+          <w:rtl w:val="0"/>
+        </w:rPr>
+        <w:t xml:space="preserve">3. Question Bank and Reusability </w:t>
+      </w:r>
+    </w:p>
+    <w:p>
+      <w:pPr>
+        <w:spacing w:line="276" w:lineRule="auto"/>
+        <w:rPr>
+          <w:b w:val="1"/>
+          <w:bCs w:val="1"/>
+          <w:highlight w:val="yellow"/>
+        </w:rPr>
+      </w:pPr>
+      <w:r>
+        <w:rPr>
+          <w:rtl w:val="0"/>
+        </w:rPr>
+      </w:r>
+    </w:p>
+    <w:p>
+      <w:pPr>
+        <w:numPr>
+          <w:ilvl w:val="0"/>
           <w:numId w:val="4"/>
         </w:numPr>
         <w:spacing w:line="276" w:lineRule="auto"/>
         <w:ind w:left="720" w:hanging="360"/>
         <w:jc w:val="both"/>
-        <w:rPr/>
-      </w:pPr>
-      <w:r>
-        <w:rPr>
-          <w:rtl w:val="0"/>
-        </w:rPr>
-        <w:t xml:space="preserve">The system can disable or restrict selected external ports (such as USB storage devices) during an active examination to prevent file-based cheating or unauthorized material access.</w:t>
+        <w:rPr>
+          <w:highlight w:val="yellow"/>
+        </w:rPr>
+      </w:pPr>
+      <w:r>
+        <w:rPr>
+          <w:highlight w:val="yellow"/>
+          <w:rtl w:val="0"/>
+        </w:rPr>
+        <w:t xml:space="preserve">The system can allow teachers to save created questions into a reusable question bank for future examinations.</w:t>
       </w:r>
     </w:p>
     <w:p>
@@ -2753,31 +3163,16 @@
         <w:spacing w:line="276" w:lineRule="auto"/>
         <w:ind w:left="720" w:hanging="360"/>
         <w:jc w:val="both"/>
-        <w:rPr/>
-      </w:pPr>
-      <w:r>
-        <w:rPr>
-          <w:rtl w:val="0"/>
-        </w:rPr>
-        <w:t xml:space="preserve">Port access is restored automatically when the examination session ends.</w:t>
-      </w:r>
-    </w:p>
-    <w:p>
-      <w:pPr>
-        <w:spacing w:after="240" w:before="240" w:line="276" w:lineRule="auto"/>
-        <w:jc w:val="both"/>
-        <w:rPr>
-          <w:b w:val="1"/>
-          <w:bCs w:val="1"/>
-        </w:rPr>
-      </w:pPr>
-      <w:r>
-        <w:rPr>
-          <w:b w:val="1"/>
-          <w:bCs w:val="1"/>
-          <w:rtl w:val="0"/>
-        </w:rPr>
-        <w:t xml:space="preserve">2. Hidden Process Detection  </w:t>
+        <w:rPr>
+          <w:highlight w:val="yellow"/>
+        </w:rPr>
+      </w:pPr>
+      <w:r>
+        <w:rPr>
+          <w:highlight w:val="yellow"/>
+          <w:rtl w:val="0"/>
+        </w:rPr>
+        <w:t xml:space="preserve">Saved questions may include Multiple Choice, and Coding question types.</w:t>
       </w:r>
     </w:p>
     <w:p>
@@ -2789,13 +3184,16 @@
         <w:spacing w:line="276" w:lineRule="auto"/>
         <w:ind w:left="720" w:hanging="360"/>
         <w:jc w:val="both"/>
-        <w:rPr/>
-      </w:pPr>
-      <w:r>
-        <w:rPr>
-          <w:rtl w:val="0"/>
-        </w:rPr>
-        <w:t xml:space="preserve">The system can detect and flag suspicious hidden background applications or disguised processes running during an examination.</w:t>
+        <w:rPr>
+          <w:highlight w:val="yellow"/>
+        </w:rPr>
+      </w:pPr>
+      <w:r>
+        <w:rPr>
+          <w:highlight w:val="yellow"/>
+          <w:rtl w:val="0"/>
+        </w:rPr>
+        <w:t xml:space="preserve">Teachers can browse, search, edit, and reuse previously created questions without rebuilding them from scratch.</w:t>
       </w:r>
     </w:p>
     <w:p>
@@ -2807,13 +3205,128 @@
         <w:spacing w:line="276" w:lineRule="auto"/>
         <w:ind w:left="720" w:hanging="360"/>
         <w:jc w:val="both"/>
-        <w:rPr/>
-      </w:pPr>
-      <w:r>
-        <w:rPr>
-          <w:rtl w:val="0"/>
-        </w:rPr>
-        <w:t xml:space="preserve">This includes applications attempting to conceal themselves from normal process lists or imitate legitimate system processes.</w:t>
+        <w:rPr>
+          <w:highlight w:val="yellow"/>
+        </w:rPr>
+      </w:pPr>
+      <w:r>
+        <w:rPr>
+          <w:highlight w:val="yellow"/>
+          <w:rtl w:val="0"/>
+        </w:rPr>
+        <w:t xml:space="preserve">This feature improves exam preparation efficiency and promotes long-term content reuse across multiple classes and examination periods. </w:t>
+      </w:r>
+    </w:p>
+    <w:p>
+      <w:pPr>
+        <w:spacing w:line="276" w:lineRule="auto"/>
+        <w:rPr>
+          <w:b w:val="1"/>
+          <w:bCs w:val="1"/>
+        </w:rPr>
+      </w:pPr>
+      <w:r>
+        <w:rPr>
+          <w:rtl w:val="0"/>
+        </w:rPr>
+      </w:r>
+    </w:p>
+    <w:p>
+      <w:pPr>
+        <w:spacing w:line="276" w:lineRule="auto"/>
+        <w:rPr>
+          <w:b w:val="1"/>
+          <w:bCs w:val="1"/>
+        </w:rPr>
+      </w:pPr>
+      <w:r>
+        <w:rPr>
+          <w:rtl w:val="0"/>
+        </w:rPr>
+      </w:r>
+    </w:p>
+    <w:p>
+      <w:pPr>
+        <w:spacing w:line="276" w:lineRule="auto"/>
+        <w:rPr>
+          <w:b w:val="1"/>
+          <w:bCs w:val="1"/>
+        </w:rPr>
+      </w:pPr>
+      <w:r>
+        <w:rPr>
+          <w:rtl w:val="0"/>
+        </w:rPr>
+      </w:r>
+    </w:p>
+    <w:p>
+      <w:pPr>
+        <w:spacing w:line="276" w:lineRule="auto"/>
+        <w:rPr>
+          <w:b w:val="1"/>
+          <w:bCs w:val="1"/>
+        </w:rPr>
+      </w:pPr>
+      <w:r>
+        <w:rPr>
+          <w:rtl w:val="0"/>
+        </w:rPr>
+      </w:r>
+    </w:p>
+    <w:p>
+      <w:pPr>
+        <w:spacing w:line="276" w:lineRule="auto"/>
+        <w:rPr>
+          <w:b w:val="1"/>
+          <w:bCs w:val="1"/>
+        </w:rPr>
+      </w:pPr>
+      <w:r>
+        <w:rPr>
+          <w:rtl w:val="0"/>
+        </w:rPr>
+      </w:r>
+    </w:p>
+    <w:p>
+      <w:pPr>
+        <w:spacing w:line="276" w:lineRule="auto"/>
+        <w:rPr>
+          <w:b w:val="1"/>
+          <w:bCs w:val="1"/>
+        </w:rPr>
+      </w:pPr>
+      <w:r>
+        <w:rPr>
+          <w:rtl w:val="0"/>
+        </w:rPr>
+      </w:r>
+    </w:p>
+    <w:p>
+      <w:pPr>
+        <w:spacing w:line="276" w:lineRule="auto"/>
+        <w:rPr>
+          <w:b w:val="1"/>
+          <w:bCs w:val="1"/>
+        </w:rPr>
+      </w:pPr>
+      <w:r>
+        <w:rPr>
+          <w:rtl w:val="0"/>
+        </w:rPr>
+      </w:r>
+    </w:p>
+    <w:p>
+      <w:pPr>
+        <w:spacing w:line="276" w:lineRule="auto"/>
+        <w:rPr>
+          <w:b w:val="1"/>
+          <w:bCs w:val="1"/>
+        </w:rPr>
+      </w:pPr>
+      <w:r>
+        <w:rPr>
+          <w:rtl w:val="0"/>
+        </w:rPr>
       </w:r>
     </w:p>
     <w:p>
@@ -4702,6 +5215,116 @@
     </w:lvl>
   </w:abstractNum>
   <w:abstractNum w:abstractNumId="15">
+    <w:lvl w:ilvl="0">
+      <w:start w:val="1"/>
+      <w:numFmt w:val="bullet"/>
+      <w:lvlText w:val="●"/>
+      <w:lvlJc w:val="left"/>
+      <w:pPr>
+        <w:ind w:left="720" w:hanging="360"/>
+      </w:pPr>
+      <w:rPr>
+        <w:u w:val="none"/>
+      </w:rPr>
+    </w:lvl>
+    <w:lvl w:ilvl="1">
+      <w:start w:val="1"/>
+      <w:numFmt w:val="bullet"/>
+      <w:lvlText w:val="○"/>
+      <w:lvlJc w:val="left"/>
+      <w:pPr>
+        <w:ind w:left="1440" w:hanging="360"/>
+      </w:pPr>
+      <w:rPr>
+        <w:u w:val="none"/>
+      </w:rPr>
+    </w:lvl>
+    <w:lvl w:ilvl="2">
+      <w:start w:val="1"/>
+      <w:numFmt w:val="bullet"/>
+      <w:lvlText w:val="■"/>
+      <w:lvlJc w:val="left"/>
+      <w:pPr>
+        <w:ind w:left="2160" w:hanging="360"/>
+      </w:pPr>
+      <w:rPr>
+        <w:u w:val="none"/>
+      </w:rPr>
+    </w:lvl>
+    <w:lvl w:ilvl="3">
+      <w:start w:val="1"/>
+      <w:numFmt w:val="bullet"/>
+      <w:lvlText w:val="●"/>
+      <w:lvlJc w:val="left"/>
+      <w:pPr>
+        <w:ind w:left="2880" w:hanging="360"/>
+      </w:pPr>
+      <w:rPr>
+        <w:u w:val="none"/>
+      </w:rPr>
+    </w:lvl>
+    <w:lvl w:ilvl="4">
+      <w:start w:val="1"/>
+      <w:numFmt w:val="bullet"/>
+      <w:lvlText w:val="○"/>
+      <w:lvlJc w:val="left"/>
+      <w:pPr>
+        <w:ind w:left="3600" w:hanging="360"/>
+      </w:pPr>
+      <w:rPr>
+        <w:u w:val="none"/>
+      </w:rPr>
+    </w:lvl>
+    <w:lvl w:ilvl="5">
+      <w:start w:val="1"/>
+      <w:numFmt w:val="bullet"/>
+      <w:lvlText w:val="■"/>
+      <w:lvlJc w:val="left"/>
+      <w:pPr>
+        <w:ind w:left="4320" w:hanging="360"/>
+      </w:pPr>
+      <w:rPr>
+        <w:u w:val="none"/>
+      </w:rPr>
+    </w:lvl>
+    <w:lvl w:ilvl="6">
+      <w:start w:val="1"/>
+      <w:numFmt w:val="bullet"/>
+      <w:lvlText w:val="●"/>
+      <w:lvlJc w:val="left"/>
+      <w:pPr>
+        <w:ind w:left="5040" w:hanging="360"/>
+      </w:pPr>
+      <w:rPr>
+        <w:u w:val="none"/>
+      </w:rPr>
+    </w:lvl>
+    <w:lvl w:ilvl="7">
+      <w:start w:val="1"/>
+      <w:numFmt w:val="bullet"/>
+      <w:lvlText w:val="○"/>
+      <w:lvlJc w:val="left"/>
+      <w:pPr>
+        <w:ind w:left="5760" w:hanging="360"/>
+      </w:pPr>
+      <w:rPr>
+        <w:u w:val="none"/>
+      </w:rPr>
+    </w:lvl>
+    <w:lvl w:ilvl="8">
+      <w:start w:val="1"/>
+      <w:numFmt w:val="bullet"/>
+      <w:lvlText w:val="■"/>
+      <w:lvlJc w:val="left"/>
+      <w:pPr>
+        <w:ind w:left="6480" w:hanging="360"/>
+      </w:pPr>
+      <w:rPr>
+        <w:u w:val="none"/>
+      </w:rPr>
+    </w:lvl>
+  </w:abstractNum>
+  <w:abstractNum w:abstractNumId="16">
     <w:lvl w:ilvl="0">
       <w:start w:val="1"/>
       <w:numFmt w:val="bullet"/>
@@ -4855,6 +5478,9 @@
   </w:num>
   <w:num w:numId="15">
     <w:abstractNumId w:val="15"/>
+  </w:num>
+  <w:num w:numId="16">
+    <w:abstractNumId w:val="16"/>
   </w:num>
 </w:numbering>
 </file>

</xml_diff>